<commit_message>
Added Matirials for Cbol DB - 17/03/2026
</commit_message>
<xml_diff>
--- a/Materiales/Reporte_COBOL.docx
+++ b/Materiales/Reporte_COBOL.docx
@@ -68,16 +68,10 @@
             <w:sdtContent>
               <w:p>
                 <w:pPr>
-                  <w:pStyle w:val="Ttulo"/>
+                  <w:pStyle w:val="TtuloTDC"/>
                 </w:pPr>
                 <w:r>
-                  <w:t>REPORTE DE APRENDIZAJE TÉCNICO</w:t>
-                </w:r>
-                <w:r>
-                  <w:t xml:space="preserve"> </w:t>
-                </w:r>
-                <w:r>
-                  <w:t>COBOL</w:t>
+                  <w:t>REPORTE DE APRENDIZAJE TÉCNICO COBOL</w:t>
                 </w:r>
               </w:p>
             </w:sdtContent>
@@ -227,7 +221,7 @@
         <w:pStyle w:val="Textoindependiente"/>
         <w:numPr>
           <w:ilvl w:val="0"/>
-          <w:numId w:val="39"/>
+          <w:numId w:val="32"/>
         </w:numPr>
       </w:pPr>
       <w:r>
@@ -239,7 +233,7 @@
         <w:pStyle w:val="Textoindependiente"/>
         <w:numPr>
           <w:ilvl w:val="0"/>
-          <w:numId w:val="39"/>
+          <w:numId w:val="32"/>
         </w:numPr>
       </w:pPr>
       <w:r>
@@ -251,7 +245,7 @@
         <w:pStyle w:val="Textoindependiente"/>
         <w:numPr>
           <w:ilvl w:val="0"/>
-          <w:numId w:val="39"/>
+          <w:numId w:val="32"/>
         </w:numPr>
       </w:pPr>
       <w:r>
@@ -263,7 +257,7 @@
         <w:pStyle w:val="Textoindependiente"/>
         <w:numPr>
           <w:ilvl w:val="0"/>
-          <w:numId w:val="39"/>
+          <w:numId w:val="32"/>
         </w:numPr>
       </w:pPr>
       <w:r>
@@ -275,7 +269,7 @@
         <w:pStyle w:val="Textoindependiente"/>
         <w:numPr>
           <w:ilvl w:val="0"/>
-          <w:numId w:val="39"/>
+          <w:numId w:val="32"/>
         </w:numPr>
       </w:pPr>
       <w:r>
@@ -287,7 +281,7 @@
         <w:pStyle w:val="Textoindependiente"/>
         <w:numPr>
           <w:ilvl w:val="0"/>
-          <w:numId w:val="39"/>
+          <w:numId w:val="32"/>
         </w:numPr>
       </w:pPr>
       <w:r>
@@ -299,7 +293,7 @@
         <w:pStyle w:val="Textoindependiente"/>
         <w:numPr>
           <w:ilvl w:val="0"/>
-          <w:numId w:val="39"/>
+          <w:numId w:val="32"/>
         </w:numPr>
       </w:pPr>
       <w:r>
@@ -471,7 +465,7 @@
         <w:pStyle w:val="Prrafodelista"/>
         <w:numPr>
           <w:ilvl w:val="0"/>
-          <w:numId w:val="32"/>
+          <w:numId w:val="29"/>
         </w:numPr>
       </w:pPr>
       <w:r>
@@ -489,7 +483,7 @@
         <w:pStyle w:val="Prrafodelista"/>
         <w:numPr>
           <w:ilvl w:val="0"/>
-          <w:numId w:val="32"/>
+          <w:numId w:val="29"/>
         </w:numPr>
       </w:pPr>
       <w:r>
@@ -507,7 +501,7 @@
         <w:pStyle w:val="Prrafodelista"/>
         <w:numPr>
           <w:ilvl w:val="0"/>
-          <w:numId w:val="32"/>
+          <w:numId w:val="29"/>
         </w:numPr>
       </w:pPr>
       <w:r>
@@ -525,7 +519,7 @@
         <w:pStyle w:val="Prrafodelista"/>
         <w:numPr>
           <w:ilvl w:val="0"/>
-          <w:numId w:val="32"/>
+          <w:numId w:val="29"/>
         </w:numPr>
       </w:pPr>
       <w:r>
@@ -602,7 +596,7 @@
         <w:pStyle w:val="Prrafodelista"/>
         <w:numPr>
           <w:ilvl w:val="0"/>
-          <w:numId w:val="33"/>
+          <w:numId w:val="30"/>
         </w:numPr>
       </w:pPr>
       <w:r>
@@ -614,7 +608,7 @@
         <w:pStyle w:val="Prrafodelista"/>
         <w:numPr>
           <w:ilvl w:val="0"/>
-          <w:numId w:val="33"/>
+          <w:numId w:val="30"/>
         </w:numPr>
       </w:pPr>
       <w:r>
@@ -626,7 +620,7 @@
         <w:pStyle w:val="Prrafodelista"/>
         <w:numPr>
           <w:ilvl w:val="0"/>
-          <w:numId w:val="33"/>
+          <w:numId w:val="30"/>
         </w:numPr>
       </w:pPr>
       <w:r>
@@ -734,7 +728,7 @@
         <w:pStyle w:val="Prrafodelista"/>
         <w:numPr>
           <w:ilvl w:val="0"/>
-          <w:numId w:val="33"/>
+          <w:numId w:val="30"/>
         </w:numPr>
       </w:pPr>
       <w:r>
@@ -749,7 +743,7 @@
         <w:pStyle w:val="Prrafodelista"/>
         <w:numPr>
           <w:ilvl w:val="0"/>
-          <w:numId w:val="33"/>
+          <w:numId w:val="30"/>
         </w:numPr>
       </w:pPr>
       <w:r>
@@ -764,7 +758,7 @@
         <w:pStyle w:val="Prrafodelista"/>
         <w:numPr>
           <w:ilvl w:val="0"/>
-          <w:numId w:val="33"/>
+          <w:numId w:val="30"/>
         </w:numPr>
       </w:pPr>
       <w:r>
@@ -922,11 +916,13 @@
         <w:ind w:left="720"/>
         <w:rPr>
           <w:color w:val="2E404D" w:themeColor="text1"/>
-        </w:rPr>
-      </w:pPr>
-      <w:r>
-        <w:rPr>
-          <w:color w:val="2E404D" w:themeColor="text1"/>
+          <w:lang w:val="fr-FR"/>
+        </w:rPr>
+      </w:pPr>
+      <w:r>
+        <w:rPr>
+          <w:color w:val="2E404D" w:themeColor="text1"/>
+          <w:lang w:val="fr-FR"/>
         </w:rPr>
         <w:lastRenderedPageBreak/>
         <w:t xml:space="preserve">05 EST-REG-NOMBRE PIC </w:t>
@@ -935,6 +931,7 @@
       <w:r>
         <w:rPr>
           <w:color w:val="2E404D" w:themeColor="text1"/>
+          <w:lang w:val="fr-FR"/>
         </w:rPr>
         <w:t>X(</w:t>
       </w:r>
@@ -942,6 +939,7 @@
       <w:r>
         <w:rPr>
           <w:color w:val="2E404D" w:themeColor="text1"/>
+          <w:lang w:val="fr-FR"/>
         </w:rPr>
         <w:t xml:space="preserve">40). </w:t>
       </w:r>
@@ -1011,7 +1009,7 @@
         <w:pStyle w:val="Prrafodelista"/>
         <w:numPr>
           <w:ilvl w:val="0"/>
-          <w:numId w:val="33"/>
+          <w:numId w:val="30"/>
         </w:numPr>
       </w:pPr>
       <w:r>
@@ -1032,7 +1030,7 @@
         <w:pStyle w:val="Prrafodelista"/>
         <w:numPr>
           <w:ilvl w:val="0"/>
-          <w:numId w:val="33"/>
+          <w:numId w:val="30"/>
         </w:numPr>
       </w:pPr>
       <w:r>
@@ -1044,7 +1042,7 @@
         <w:pStyle w:val="Prrafodelista"/>
         <w:numPr>
           <w:ilvl w:val="0"/>
-          <w:numId w:val="33"/>
+          <w:numId w:val="30"/>
         </w:numPr>
       </w:pPr>
       <w:r>
@@ -1056,7 +1054,7 @@
         <w:pStyle w:val="Prrafodelista"/>
         <w:numPr>
           <w:ilvl w:val="0"/>
-          <w:numId w:val="33"/>
+          <w:numId w:val="30"/>
         </w:numPr>
       </w:pPr>
       <w:r>
@@ -1112,25 +1110,44 @@
       <w:pPr>
         <w:rPr>
           <w:color w:val="2E404D" w:themeColor="text1"/>
-        </w:rPr>
-      </w:pPr>
-      <w:r>
-        <w:rPr>
-          <w:color w:val="2E404D" w:themeColor="text1"/>
-        </w:rPr>
-        <w:t>Ejemplo conceptual:</w:t>
-      </w:r>
-    </w:p>
-    <w:p/>
-    <w:p>
-      <w:pPr>
-        <w:rPr>
-          <w:color w:val="2E404D" w:themeColor="text1"/>
-        </w:rPr>
-      </w:pPr>
-      <w:r>
-        <w:rPr>
-          <w:color w:val="2E404D" w:themeColor="text1"/>
+          <w:lang w:val="en-GB"/>
+        </w:rPr>
+      </w:pPr>
+      <w:proofErr w:type="spellStart"/>
+      <w:r>
+        <w:rPr>
+          <w:color w:val="2E404D" w:themeColor="text1"/>
+          <w:lang w:val="en-GB"/>
+        </w:rPr>
+        <w:t>Ejemplo</w:t>
+      </w:r>
+      <w:proofErr w:type="spellEnd"/>
+      <w:r>
+        <w:rPr>
+          <w:color w:val="2E404D" w:themeColor="text1"/>
+          <w:lang w:val="en-GB"/>
+        </w:rPr>
+        <w:t xml:space="preserve"> conceptual:</w:t>
+      </w:r>
+    </w:p>
+    <w:p>
+      <w:pPr>
+        <w:rPr>
+          <w:lang w:val="en-GB"/>
+        </w:rPr>
+      </w:pPr>
+    </w:p>
+    <w:p>
+      <w:pPr>
+        <w:rPr>
+          <w:color w:val="2E404D" w:themeColor="text1"/>
+          <w:lang w:val="en-GB"/>
+        </w:rPr>
+      </w:pPr>
+      <w:r>
+        <w:rPr>
+          <w:color w:val="2E404D" w:themeColor="text1"/>
+          <w:lang w:val="en-GB"/>
         </w:rPr>
         <w:t>READ ARCHIVO</w:t>
       </w:r>
@@ -1139,24 +1156,22 @@
       <w:pPr>
         <w:rPr>
           <w:color w:val="2E404D" w:themeColor="text1"/>
-        </w:rPr>
-      </w:pPr>
-      <w:r>
-        <w:rPr>
-          <w:color w:val="2E404D" w:themeColor="text1"/>
+          <w:lang w:val="en-GB"/>
+        </w:rPr>
+      </w:pPr>
+      <w:r>
+        <w:rPr>
+          <w:color w:val="2E404D" w:themeColor="text1"/>
+          <w:lang w:val="en-GB"/>
         </w:rPr>
         <w:t xml:space="preserve">   </w:t>
       </w:r>
       <w:r>
         <w:rPr>
           <w:color w:val="2E404D" w:themeColor="text1"/>
+          <w:lang w:val="en-GB"/>
         </w:rPr>
         <w:tab/>
-      </w:r>
-      <w:r>
-        <w:rPr>
-          <w:color w:val="2E404D" w:themeColor="text1"/>
-        </w:rPr>
         <w:t>AT END</w:t>
       </w:r>
     </w:p>
@@ -1164,30 +1179,29 @@
       <w:pPr>
         <w:rPr>
           <w:color w:val="2E404D" w:themeColor="text1"/>
-        </w:rPr>
-      </w:pPr>
-      <w:r>
-        <w:rPr>
-          <w:color w:val="2E404D" w:themeColor="text1"/>
+          <w:lang w:val="en-GB"/>
+        </w:rPr>
+      </w:pPr>
+      <w:r>
+        <w:rPr>
+          <w:color w:val="2E404D" w:themeColor="text1"/>
+          <w:lang w:val="en-GB"/>
         </w:rPr>
         <w:t xml:space="preserve">      </w:t>
       </w:r>
       <w:r>
         <w:rPr>
           <w:color w:val="2E404D" w:themeColor="text1"/>
+          <w:lang w:val="en-GB"/>
         </w:rPr>
         <w:tab/>
       </w:r>
       <w:r>
         <w:rPr>
           <w:color w:val="2E404D" w:themeColor="text1"/>
+          <w:lang w:val="en-GB"/>
         </w:rPr>
         <w:tab/>
-      </w:r>
-      <w:r>
-        <w:rPr>
-          <w:color w:val="2E404D" w:themeColor="text1"/>
-        </w:rPr>
         <w:t>SET FIN-ARCHIVO TO TRUE</w:t>
       </w:r>
     </w:p>
@@ -1195,11 +1209,13 @@
       <w:pPr>
         <w:rPr>
           <w:color w:val="2E404D" w:themeColor="text1"/>
-        </w:rPr>
-      </w:pPr>
-      <w:r>
-        <w:rPr>
-          <w:color w:val="2E404D" w:themeColor="text1"/>
+          <w:lang w:val="en-GB"/>
+        </w:rPr>
+      </w:pPr>
+      <w:r>
+        <w:rPr>
+          <w:color w:val="2E404D" w:themeColor="text1"/>
+          <w:lang w:val="en-GB"/>
         </w:rPr>
         <w:t>END-READ</w:t>
       </w:r>
@@ -1208,6 +1224,7 @@
       <w:pPr>
         <w:rPr>
           <w:color w:val="2E404D" w:themeColor="text1"/>
+          <w:lang w:val="en-GB"/>
         </w:rPr>
       </w:pPr>
     </w:p>
@@ -1291,7 +1308,7 @@
         <w:pStyle w:val="Prrafodelista"/>
         <w:numPr>
           <w:ilvl w:val="0"/>
-          <w:numId w:val="32"/>
+          <w:numId w:val="29"/>
         </w:numPr>
       </w:pPr>
       <w:r>
@@ -1303,7 +1320,7 @@
         <w:pStyle w:val="Prrafodelista"/>
         <w:numPr>
           <w:ilvl w:val="0"/>
-          <w:numId w:val="32"/>
+          <w:numId w:val="29"/>
         </w:numPr>
       </w:pPr>
       <w:r>
@@ -1743,7 +1760,7 @@
         <w:pStyle w:val="Prrafodelista"/>
         <w:numPr>
           <w:ilvl w:val="0"/>
-          <w:numId w:val="32"/>
+          <w:numId w:val="29"/>
         </w:numPr>
       </w:pPr>
       <w:r>
@@ -1755,7 +1772,7 @@
         <w:pStyle w:val="Prrafodelista"/>
         <w:numPr>
           <w:ilvl w:val="0"/>
-          <w:numId w:val="32"/>
+          <w:numId w:val="29"/>
         </w:numPr>
       </w:pPr>
       <w:r>
@@ -1767,7 +1784,7 @@
         <w:pStyle w:val="Prrafodelista"/>
         <w:numPr>
           <w:ilvl w:val="0"/>
-          <w:numId w:val="32"/>
+          <w:numId w:val="29"/>
         </w:numPr>
       </w:pPr>
       <w:r>
@@ -1984,7 +2001,7 @@
         <w:pStyle w:val="Prrafodelista"/>
         <w:numPr>
           <w:ilvl w:val="0"/>
-          <w:numId w:val="47"/>
+          <w:numId w:val="33"/>
         </w:numPr>
       </w:pPr>
       <w:r>
@@ -1996,7 +2013,7 @@
         <w:pStyle w:val="Prrafodelista"/>
         <w:numPr>
           <w:ilvl w:val="0"/>
-          <w:numId w:val="47"/>
+          <w:numId w:val="33"/>
         </w:numPr>
       </w:pPr>
       <w:r>
@@ -2008,7 +2025,7 @@
         <w:pStyle w:val="Prrafodelista"/>
         <w:numPr>
           <w:ilvl w:val="0"/>
-          <w:numId w:val="47"/>
+          <w:numId w:val="33"/>
         </w:numPr>
       </w:pPr>
       <w:r>
@@ -2360,11 +2377,13 @@
       <w:pPr>
         <w:rPr>
           <w:color w:val="2E404D" w:themeColor="text1"/>
-        </w:rPr>
-      </w:pPr>
-      <w:r>
-        <w:rPr>
-          <w:color w:val="2E404D" w:themeColor="text1"/>
+          <w:lang w:val="en-GB"/>
+        </w:rPr>
+      </w:pPr>
+      <w:r>
+        <w:rPr>
+          <w:color w:val="2E404D" w:themeColor="text1"/>
+          <w:lang w:val="en-GB"/>
         </w:rPr>
         <w:t xml:space="preserve">01 SWITCHES PIC </w:t>
       </w:r>
@@ -2372,6 +2391,7 @@
       <w:r>
         <w:rPr>
           <w:color w:val="2E404D" w:themeColor="text1"/>
+          <w:lang w:val="en-GB"/>
         </w:rPr>
         <w:t>X(</w:t>
       </w:r>
@@ -2379,6 +2399,7 @@
       <w:r>
         <w:rPr>
           <w:color w:val="2E404D" w:themeColor="text1"/>
+          <w:lang w:val="en-GB"/>
         </w:rPr>
         <w:t>02) VALUE "NO".</w:t>
       </w:r>
@@ -2392,8 +2413,15 @@
       <w:r>
         <w:rPr>
           <w:color w:val="2E404D" w:themeColor="text1"/>
-        </w:rPr>
-        <w:t xml:space="preserve">   88 SW-CONTINUAR VALUE "NO".</w:t>
+          <w:lang w:val="en-GB"/>
+        </w:rPr>
+        <w:t xml:space="preserve">   </w:t>
+      </w:r>
+      <w:r>
+        <w:rPr>
+          <w:color w:val="2E404D" w:themeColor="text1"/>
+        </w:rPr>
+        <w:t>88 SW-CONTINUAR VALUE "NO".</w:t>
       </w:r>
     </w:p>
     <w:p>
@@ -2539,29 +2567,22 @@
       <w:pPr>
         <w:pStyle w:val="NTTBodyText"/>
         <w:ind w:left="0"/>
-        <w:rPr>
-          <w:lang w:val="es-MX"/>
-        </w:rPr>
-      </w:pPr>
-      <w:r>
-        <w:rPr>
-          <w:lang w:val="es-MX"/>
-        </w:rPr>
-        <w:t>Ejemplo:</w:t>
+      </w:pPr>
+      <w:proofErr w:type="spellStart"/>
+      <w:r>
+        <w:t>Ejemplo</w:t>
+      </w:r>
+      <w:proofErr w:type="spellEnd"/>
+      <w:r>
+        <w:t>:</w:t>
       </w:r>
     </w:p>
     <w:p>
       <w:pPr>
         <w:pStyle w:val="NTTBodyText"/>
         <w:ind w:left="0" w:firstLine="720"/>
-        <w:rPr>
-          <w:lang w:val="es-MX"/>
-        </w:rPr>
-      </w:pPr>
-      <w:r>
-        <w:rPr>
-          <w:lang w:val="es-MX"/>
-        </w:rPr>
+      </w:pPr>
+      <w:r>
         <w:t>PERFORM HEADER-MAKER</w:t>
       </w:r>
     </w:p>
@@ -2569,14 +2590,8 @@
       <w:pPr>
         <w:pStyle w:val="NTTBodyText"/>
         <w:ind w:left="0" w:firstLine="720"/>
-        <w:rPr>
-          <w:lang w:val="es-MX"/>
-        </w:rPr>
-      </w:pPr>
-      <w:r>
-        <w:rPr>
-          <w:lang w:val="es-MX"/>
-        </w:rPr>
+      </w:pPr>
+      <w:r>
         <w:t>PERFORM DATA-IN</w:t>
       </w:r>
     </w:p>
@@ -2600,7 +2615,7 @@
         <w:pStyle w:val="Prrafodelista"/>
         <w:numPr>
           <w:ilvl w:val="0"/>
-          <w:numId w:val="32"/>
+          <w:numId w:val="29"/>
         </w:numPr>
       </w:pPr>
       <w:r>
@@ -2612,7 +2627,7 @@
         <w:pStyle w:val="Prrafodelista"/>
         <w:numPr>
           <w:ilvl w:val="0"/>
-          <w:numId w:val="32"/>
+          <w:numId w:val="29"/>
         </w:numPr>
       </w:pPr>
       <w:r>
@@ -2624,7 +2639,7 @@
         <w:pStyle w:val="Prrafodelista"/>
         <w:numPr>
           <w:ilvl w:val="0"/>
-          <w:numId w:val="32"/>
+          <w:numId w:val="29"/>
         </w:numPr>
       </w:pPr>
       <w:r>
@@ -2890,7 +2905,7 @@
         <w:pStyle w:val="Prrafodelista"/>
         <w:numPr>
           <w:ilvl w:val="0"/>
-          <w:numId w:val="49"/>
+          <w:numId w:val="34"/>
         </w:numPr>
         <w:rPr>
           <w:rFonts w:eastAsia="Times New Roman" w:cs="Arial"/>
@@ -2914,7 +2929,7 @@
         <w:pStyle w:val="Prrafodelista"/>
         <w:numPr>
           <w:ilvl w:val="0"/>
-          <w:numId w:val="49"/>
+          <w:numId w:val="34"/>
         </w:numPr>
         <w:rPr>
           <w:rFonts w:eastAsia="Times New Roman" w:cs="Arial"/>
@@ -2938,7 +2953,7 @@
         <w:pStyle w:val="Prrafodelista"/>
         <w:numPr>
           <w:ilvl w:val="0"/>
-          <w:numId w:val="49"/>
+          <w:numId w:val="34"/>
         </w:numPr>
         <w:rPr>
           <w:rFonts w:eastAsia="Times New Roman" w:cs="Arial"/>
@@ -2962,7 +2977,7 @@
         <w:pStyle w:val="Prrafodelista"/>
         <w:numPr>
           <w:ilvl w:val="0"/>
-          <w:numId w:val="49"/>
+          <w:numId w:val="34"/>
         </w:numPr>
         <w:rPr>
           <w:rFonts w:eastAsia="Times New Roman" w:cs="Arial"/>
@@ -3235,7 +3250,7 @@
         <w:pStyle w:val="Prrafodelista"/>
         <w:numPr>
           <w:ilvl w:val="0"/>
-          <w:numId w:val="32"/>
+          <w:numId w:val="29"/>
         </w:numPr>
       </w:pPr>
       <w:r>
@@ -3250,7 +3265,7 @@
         <w:pStyle w:val="Prrafodelista"/>
         <w:numPr>
           <w:ilvl w:val="1"/>
-          <w:numId w:val="32"/>
+          <w:numId w:val="29"/>
         </w:numPr>
       </w:pPr>
       <w:proofErr w:type="spellStart"/>
@@ -3272,7 +3287,7 @@
         <w:pStyle w:val="Prrafodelista"/>
         <w:numPr>
           <w:ilvl w:val="0"/>
-          <w:numId w:val="32"/>
+          <w:numId w:val="29"/>
         </w:numPr>
       </w:pPr>
       <w:r>
@@ -3287,7 +3302,7 @@
         <w:pStyle w:val="Prrafodelista"/>
         <w:numPr>
           <w:ilvl w:val="1"/>
-          <w:numId w:val="32"/>
+          <w:numId w:val="29"/>
         </w:numPr>
       </w:pPr>
       <w:proofErr w:type="spellStart"/>
@@ -3324,7 +3339,7 @@
         <w:pStyle w:val="Prrafodelista"/>
         <w:numPr>
           <w:ilvl w:val="0"/>
-          <w:numId w:val="32"/>
+          <w:numId w:val="29"/>
         </w:numPr>
       </w:pPr>
       <w:r>
@@ -3336,7 +3351,7 @@
         <w:pStyle w:val="Prrafodelista"/>
         <w:numPr>
           <w:ilvl w:val="0"/>
-          <w:numId w:val="32"/>
+          <w:numId w:val="29"/>
         </w:numPr>
       </w:pPr>
       <w:r>
@@ -3348,7 +3363,7 @@
         <w:pStyle w:val="Prrafodelista"/>
         <w:numPr>
           <w:ilvl w:val="0"/>
-          <w:numId w:val="32"/>
+          <w:numId w:val="29"/>
         </w:numPr>
       </w:pPr>
       <w:r>
@@ -3414,7 +3429,7 @@
         <w:pStyle w:val="Prrafodelista"/>
         <w:numPr>
           <w:ilvl w:val="0"/>
-          <w:numId w:val="32"/>
+          <w:numId w:val="29"/>
         </w:numPr>
       </w:pPr>
       <w:r>
@@ -3426,7 +3441,7 @@
         <w:pStyle w:val="Prrafodelista"/>
         <w:numPr>
           <w:ilvl w:val="0"/>
-          <w:numId w:val="32"/>
+          <w:numId w:val="29"/>
         </w:numPr>
       </w:pPr>
       <w:r>
@@ -3438,7 +3453,7 @@
         <w:pStyle w:val="Prrafodelista"/>
         <w:numPr>
           <w:ilvl w:val="0"/>
-          <w:numId w:val="32"/>
+          <w:numId w:val="29"/>
         </w:numPr>
       </w:pPr>
       <w:r>
@@ -3450,7 +3465,7 @@
         <w:pStyle w:val="Prrafodelista"/>
         <w:numPr>
           <w:ilvl w:val="0"/>
-          <w:numId w:val="32"/>
+          <w:numId w:val="29"/>
         </w:numPr>
       </w:pPr>
       <w:r>
@@ -3462,7 +3477,7 @@
         <w:pStyle w:val="Prrafodelista"/>
         <w:numPr>
           <w:ilvl w:val="0"/>
-          <w:numId w:val="32"/>
+          <w:numId w:val="29"/>
         </w:numPr>
       </w:pPr>
       <w:r>
@@ -3474,7 +3489,7 @@
         <w:pStyle w:val="Prrafodelista"/>
         <w:numPr>
           <w:ilvl w:val="0"/>
-          <w:numId w:val="32"/>
+          <w:numId w:val="29"/>
         </w:numPr>
       </w:pPr>
       <w:proofErr w:type="spellStart"/>
@@ -3491,7 +3506,7 @@
         <w:pStyle w:val="Prrafodelista"/>
         <w:numPr>
           <w:ilvl w:val="0"/>
-          <w:numId w:val="32"/>
+          <w:numId w:val="29"/>
         </w:numPr>
       </w:pPr>
       <w:r>
@@ -3503,7 +3518,7 @@
         <w:pStyle w:val="Prrafodelista"/>
         <w:numPr>
           <w:ilvl w:val="0"/>
-          <w:numId w:val="32"/>
+          <w:numId w:val="29"/>
         </w:numPr>
       </w:pPr>
       <w:r>
@@ -3593,15 +3608,23 @@
         <w:pStyle w:val="Prrafodelista"/>
         <w:numPr>
           <w:ilvl w:val="0"/>
-          <w:numId w:val="37"/>
+          <w:numId w:val="31"/>
         </w:numPr>
+        <w:rPr>
+          <w:b/>
+          <w:bCs/>
+          <w:lang w:val="en-GB"/>
+        </w:rPr>
       </w:pPr>
       <w:hyperlink r:id="rId23" w:history="1">
         <w:r>
           <w:rPr>
             <w:rStyle w:val="Hipervnculo"/>
+            <w:b/>
+            <w:bCs/>
+            <w:lang w:val="en-GB"/>
           </w:rPr>
-          <w:t>https://www.opencells.dev/docs/index.html</w:t>
+          <w:t>Cobol tutorial for Beginners | Cobol Essential Training</w:t>
         </w:r>
       </w:hyperlink>
     </w:p>
@@ -3610,8 +3633,13 @@
         <w:pStyle w:val="Prrafodelista"/>
         <w:numPr>
           <w:ilvl w:val="0"/>
-          <w:numId w:val="37"/>
+          <w:numId w:val="31"/>
         </w:numPr>
+        <w:rPr>
+          <w:b/>
+          <w:bCs/>
+          <w:lang w:val="en-GB"/>
+        </w:rPr>
       </w:pPr>
       <w:hyperlink r:id="rId24" w:history="1">
         <w:r>
@@ -3619,77 +3647,7 @@
             <w:rStyle w:val="Hipervnculo"/>
             <w:b/>
             <w:bCs/>
-          </w:rPr>
-          <w:t xml:space="preserve">Cobol tutorial </w:t>
-        </w:r>
-        <w:proofErr w:type="spellStart"/>
-        <w:r>
-          <w:rPr>
-            <w:rStyle w:val="Hipervnculo"/>
-            <w:b/>
-            <w:bCs/>
-          </w:rPr>
-          <w:t>for</w:t>
-        </w:r>
-        <w:proofErr w:type="spellEnd"/>
-        <w:r>
-          <w:rPr>
-            <w:rStyle w:val="Hipervnculo"/>
-            <w:b/>
-            <w:bCs/>
-          </w:rPr>
-          <w:t xml:space="preserve"> </w:t>
-        </w:r>
-        <w:proofErr w:type="spellStart"/>
-        <w:r>
-          <w:rPr>
-            <w:rStyle w:val="Hipervnculo"/>
-            <w:b/>
-            <w:bCs/>
-          </w:rPr>
-          <w:t>Beginners</w:t>
-        </w:r>
-        <w:proofErr w:type="spellEnd"/>
-        <w:r>
-          <w:rPr>
-            <w:rStyle w:val="Hipervnculo"/>
-            <w:b/>
-            <w:bCs/>
-          </w:rPr>
-          <w:t xml:space="preserve"> | Cobol </w:t>
-        </w:r>
-        <w:proofErr w:type="spellStart"/>
-        <w:r>
-          <w:rPr>
-            <w:rStyle w:val="Hipervnculo"/>
-            <w:b/>
-            <w:bCs/>
-          </w:rPr>
-          <w:t>Essential</w:t>
-        </w:r>
-        <w:proofErr w:type="spellEnd"/>
-        <w:r>
-          <w:rPr>
-            <w:rStyle w:val="Hipervnculo"/>
-            <w:b/>
-            <w:bCs/>
-          </w:rPr>
-          <w:t xml:space="preserve"> Training</w:t>
-        </w:r>
-      </w:hyperlink>
-    </w:p>
-    <w:p>
-      <w:pPr>
-        <w:pStyle w:val="Prrafodelista"/>
-        <w:numPr>
-          <w:ilvl w:val="0"/>
-          <w:numId w:val="37"/>
-        </w:numPr>
-      </w:pPr>
-      <w:hyperlink r:id="rId25" w:history="1">
-        <w:r>
-          <w:rPr>
-            <w:rStyle w:val="Hipervnculo"/>
+            <w:lang w:val="en-GB"/>
           </w:rPr>
           <w:t>MAINFRAME || COBOL ARRAYS - INTERNAL TABLE, SUBSCRIPT, INDEX, S0C4, BEST EXPLANATION</w:t>
         </w:r>
@@ -3703,10 +3661,10 @@
       </w:pPr>
     </w:p>
     <w:sectPr>
-      <w:headerReference w:type="default" r:id="rId26"/>
-      <w:footerReference w:type="default" r:id="rId27"/>
-      <w:headerReference w:type="first" r:id="rId28"/>
-      <w:footerReference w:type="first" r:id="rId29"/>
+      <w:headerReference w:type="default" r:id="rId25"/>
+      <w:footerReference w:type="default" r:id="rId26"/>
+      <w:headerReference w:type="first" r:id="rId27"/>
+      <w:footerReference w:type="first" r:id="rId28"/>
       <w:pgSz w:w="11906" w:h="16838"/>
       <w:pgMar w:top="1609" w:right="1134" w:bottom="1134" w:left="1134" w:header="709" w:footer="471" w:gutter="0"/>
       <w:cols w:space="708"/>
@@ -5046,9 +5004,6 @@
     <w:pPr>
       <w:pStyle w:val="Encabezado"/>
     </w:pPr>
-    <w:r>
-      <w:t>REPORTE DE APRENDIZAJE TÉCNICO COBOL</w:t>
-    </w:r>
     <w:sdt>
       <w:sdtPr>
         <w:rPr>
@@ -5312,232 +5267,6 @@
 <file path=word/numbering.xml><?xml version="1.0" encoding="utf-8"?>
 <w:numbering xmlns:wpc="http://schemas.microsoft.com/office/word/2010/wordprocessingCanvas" xmlns:cx="http://schemas.microsoft.com/office/drawing/2014/chartex" xmlns:cx1="http://schemas.microsoft.com/office/drawing/2015/9/8/chartex" xmlns:cx2="http://schemas.microsoft.com/office/drawing/2015/10/21/chartex" xmlns:cx3="http://schemas.microsoft.com/office/drawing/2016/5/9/chartex" xmlns:cx4="http://schemas.microsoft.com/office/drawing/2016/5/10/chartex" xmlns:cx5="http://schemas.microsoft.com/office/drawing/2016/5/11/chartex" xmlns:cx6="http://schemas.microsoft.com/office/drawing/2016/5/12/chartex" xmlns:cx7="http://schemas.microsoft.com/office/drawing/2016/5/13/chartex" xmlns:cx8="http://schemas.microsoft.com/office/drawing/2016/5/14/chartex" xmlns:mc="http://schemas.openxmlformats.org/markup-compatibility/2006" xmlns:aink="http://schemas.microsoft.com/office/drawing/2016/ink" xmlns:am3d="http://schemas.microsoft.com/office/drawing/2017/model3d" xmlns:o="urn:schemas-microsoft-com:office:office" xmlns:oel="http://schemas.microsoft.com/office/2019/extlst" xmlns:r="http://schemas.openxmlformats.org/officeDocument/2006/relationships" xmlns:m="http://schemas.openxmlformats.org/officeDocument/2006/math" xmlns:v="urn:schemas-microsoft-com:vml" xmlns:wp14="http://schemas.microsoft.com/office/word/2010/wordprocessingDrawing" xmlns:wp="http://schemas.openxmlformats.org/drawingml/2006/wordprocessingDrawing" xmlns:w10="urn:schemas-microsoft-com:office:word" xmlns:w="http://schemas.openxmlformats.org/wordprocessingml/2006/main" xmlns:w14="http://schemas.microsoft.com/office/word/2010/wordml" xmlns:w15="http://schemas.microsoft.com/office/word/2012/wordml" xmlns:w16cex="http://schemas.microsoft.com/office/word/2018/wordml/cex" xmlns:w16cid="http://schemas.microsoft.com/office/word/2016/wordml/cid" xmlns:w16="http://schemas.microsoft.com/office/word/2018/wordml" xmlns:w16du="http://schemas.microsoft.com/office/word/2023/wordml/word16du" xmlns:w16sdtdh="http://schemas.microsoft.com/office/word/2020/wordml/sdtdatahash" xmlns:w16sdtfl="http://schemas.microsoft.com/office/word/2024/wordml/sdtformatlock" xmlns:w16se="http://schemas.microsoft.com/office/word/2015/wordml/symex" xmlns:wpg="http://schemas.microsoft.com/office/word/2010/wordprocessingGroup" xmlns:wpi="http://schemas.microsoft.com/office/word/2010/wordprocessingInk" xmlns:wne="http://schemas.microsoft.com/office/word/2006/wordml" xmlns:wps="http://schemas.microsoft.com/office/word/2010/wordprocessingShape" mc:Ignorable="w14 w15 w16se w16cid w16 w16cex w16sdtdh w16sdtfl w16du wp14">
   <w:abstractNum w:abstractNumId="0" w15:restartNumberingAfterBreak="0">
-    <w:nsid w:val="0350552D"/>
-    <w:multiLevelType w:val="hybridMultilevel"/>
-    <w:tmpl w:val="ED22B892"/>
-    <w:lvl w:ilvl="0" w:tplc="080A0001">
-      <w:start w:val="1"/>
-      <w:numFmt w:val="bullet"/>
-      <w:lvlText w:val=""/>
-      <w:lvlJc w:val="left"/>
-      <w:pPr>
-        <w:ind w:left="720" w:hanging="360"/>
-      </w:pPr>
-      <w:rPr>
-        <w:rFonts w:ascii="Symbol" w:hAnsi="Symbol" w:hint="default"/>
-      </w:rPr>
-    </w:lvl>
-    <w:lvl w:ilvl="1" w:tplc="080A0003" w:tentative="1">
-      <w:start w:val="1"/>
-      <w:numFmt w:val="bullet"/>
-      <w:lvlText w:val="o"/>
-      <w:lvlJc w:val="left"/>
-      <w:pPr>
-        <w:ind w:left="1440" w:hanging="360"/>
-      </w:pPr>
-      <w:rPr>
-        <w:rFonts w:ascii="Courier New" w:hAnsi="Courier New" w:cs="Courier New" w:hint="default"/>
-      </w:rPr>
-    </w:lvl>
-    <w:lvl w:ilvl="2" w:tplc="080A0005" w:tentative="1">
-      <w:start w:val="1"/>
-      <w:numFmt w:val="bullet"/>
-      <w:lvlText w:val=""/>
-      <w:lvlJc w:val="left"/>
-      <w:pPr>
-        <w:ind w:left="2160" w:hanging="360"/>
-      </w:pPr>
-      <w:rPr>
-        <w:rFonts w:ascii="Wingdings" w:hAnsi="Wingdings" w:hint="default"/>
-      </w:rPr>
-    </w:lvl>
-    <w:lvl w:ilvl="3" w:tplc="080A0001" w:tentative="1">
-      <w:start w:val="1"/>
-      <w:numFmt w:val="bullet"/>
-      <w:lvlText w:val=""/>
-      <w:lvlJc w:val="left"/>
-      <w:pPr>
-        <w:ind w:left="2880" w:hanging="360"/>
-      </w:pPr>
-      <w:rPr>
-        <w:rFonts w:ascii="Symbol" w:hAnsi="Symbol" w:hint="default"/>
-      </w:rPr>
-    </w:lvl>
-    <w:lvl w:ilvl="4" w:tplc="080A0003" w:tentative="1">
-      <w:start w:val="1"/>
-      <w:numFmt w:val="bullet"/>
-      <w:lvlText w:val="o"/>
-      <w:lvlJc w:val="left"/>
-      <w:pPr>
-        <w:ind w:left="3600" w:hanging="360"/>
-      </w:pPr>
-      <w:rPr>
-        <w:rFonts w:ascii="Courier New" w:hAnsi="Courier New" w:cs="Courier New" w:hint="default"/>
-      </w:rPr>
-    </w:lvl>
-    <w:lvl w:ilvl="5" w:tplc="080A0005" w:tentative="1">
-      <w:start w:val="1"/>
-      <w:numFmt w:val="bullet"/>
-      <w:lvlText w:val=""/>
-      <w:lvlJc w:val="left"/>
-      <w:pPr>
-        <w:ind w:left="4320" w:hanging="360"/>
-      </w:pPr>
-      <w:rPr>
-        <w:rFonts w:ascii="Wingdings" w:hAnsi="Wingdings" w:hint="default"/>
-      </w:rPr>
-    </w:lvl>
-    <w:lvl w:ilvl="6" w:tplc="080A0001" w:tentative="1">
-      <w:start w:val="1"/>
-      <w:numFmt w:val="bullet"/>
-      <w:lvlText w:val=""/>
-      <w:lvlJc w:val="left"/>
-      <w:pPr>
-        <w:ind w:left="5040" w:hanging="360"/>
-      </w:pPr>
-      <w:rPr>
-        <w:rFonts w:ascii="Symbol" w:hAnsi="Symbol" w:hint="default"/>
-      </w:rPr>
-    </w:lvl>
-    <w:lvl w:ilvl="7" w:tplc="080A0003" w:tentative="1">
-      <w:start w:val="1"/>
-      <w:numFmt w:val="bullet"/>
-      <w:lvlText w:val="o"/>
-      <w:lvlJc w:val="left"/>
-      <w:pPr>
-        <w:ind w:left="5760" w:hanging="360"/>
-      </w:pPr>
-      <w:rPr>
-        <w:rFonts w:ascii="Courier New" w:hAnsi="Courier New" w:cs="Courier New" w:hint="default"/>
-      </w:rPr>
-    </w:lvl>
-    <w:lvl w:ilvl="8" w:tplc="080A0005" w:tentative="1">
-      <w:start w:val="1"/>
-      <w:numFmt w:val="bullet"/>
-      <w:lvlText w:val=""/>
-      <w:lvlJc w:val="left"/>
-      <w:pPr>
-        <w:ind w:left="6480" w:hanging="360"/>
-      </w:pPr>
-      <w:rPr>
-        <w:rFonts w:ascii="Wingdings" w:hAnsi="Wingdings" w:hint="default"/>
-      </w:rPr>
-    </w:lvl>
-  </w:abstractNum>
-  <w:abstractNum w:abstractNumId="1" w15:restartNumberingAfterBreak="0">
-    <w:nsid w:val="03C300DD"/>
-    <w:multiLevelType w:val="hybridMultilevel"/>
-    <w:tmpl w:val="95B6FB42"/>
-    <w:lvl w:ilvl="0" w:tplc="080A0001">
-      <w:start w:val="1"/>
-      <w:numFmt w:val="bullet"/>
-      <w:lvlText w:val=""/>
-      <w:lvlJc w:val="left"/>
-      <w:pPr>
-        <w:ind w:left="720" w:hanging="360"/>
-      </w:pPr>
-      <w:rPr>
-        <w:rFonts w:ascii="Symbol" w:hAnsi="Symbol" w:hint="default"/>
-      </w:rPr>
-    </w:lvl>
-    <w:lvl w:ilvl="1" w:tplc="080A0003" w:tentative="1">
-      <w:start w:val="1"/>
-      <w:numFmt w:val="bullet"/>
-      <w:lvlText w:val="o"/>
-      <w:lvlJc w:val="left"/>
-      <w:pPr>
-        <w:ind w:left="1440" w:hanging="360"/>
-      </w:pPr>
-      <w:rPr>
-        <w:rFonts w:ascii="Courier New" w:hAnsi="Courier New" w:cs="Courier New" w:hint="default"/>
-      </w:rPr>
-    </w:lvl>
-    <w:lvl w:ilvl="2" w:tplc="080A0005" w:tentative="1">
-      <w:start w:val="1"/>
-      <w:numFmt w:val="bullet"/>
-      <w:lvlText w:val=""/>
-      <w:lvlJc w:val="left"/>
-      <w:pPr>
-        <w:ind w:left="2160" w:hanging="360"/>
-      </w:pPr>
-      <w:rPr>
-        <w:rFonts w:ascii="Wingdings" w:hAnsi="Wingdings" w:hint="default"/>
-      </w:rPr>
-    </w:lvl>
-    <w:lvl w:ilvl="3" w:tplc="080A0001" w:tentative="1">
-      <w:start w:val="1"/>
-      <w:numFmt w:val="bullet"/>
-      <w:lvlText w:val=""/>
-      <w:lvlJc w:val="left"/>
-      <w:pPr>
-        <w:ind w:left="2880" w:hanging="360"/>
-      </w:pPr>
-      <w:rPr>
-        <w:rFonts w:ascii="Symbol" w:hAnsi="Symbol" w:hint="default"/>
-      </w:rPr>
-    </w:lvl>
-    <w:lvl w:ilvl="4" w:tplc="080A0003" w:tentative="1">
-      <w:start w:val="1"/>
-      <w:numFmt w:val="bullet"/>
-      <w:lvlText w:val="o"/>
-      <w:lvlJc w:val="left"/>
-      <w:pPr>
-        <w:ind w:left="3600" w:hanging="360"/>
-      </w:pPr>
-      <w:rPr>
-        <w:rFonts w:ascii="Courier New" w:hAnsi="Courier New" w:cs="Courier New" w:hint="default"/>
-      </w:rPr>
-    </w:lvl>
-    <w:lvl w:ilvl="5" w:tplc="080A0005" w:tentative="1">
-      <w:start w:val="1"/>
-      <w:numFmt w:val="bullet"/>
-      <w:lvlText w:val=""/>
-      <w:lvlJc w:val="left"/>
-      <w:pPr>
-        <w:ind w:left="4320" w:hanging="360"/>
-      </w:pPr>
-      <w:rPr>
-        <w:rFonts w:ascii="Wingdings" w:hAnsi="Wingdings" w:hint="default"/>
-      </w:rPr>
-    </w:lvl>
-    <w:lvl w:ilvl="6" w:tplc="080A0001" w:tentative="1">
-      <w:start w:val="1"/>
-      <w:numFmt w:val="bullet"/>
-      <w:lvlText w:val=""/>
-      <w:lvlJc w:val="left"/>
-      <w:pPr>
-        <w:ind w:left="5040" w:hanging="360"/>
-      </w:pPr>
-      <w:rPr>
-        <w:rFonts w:ascii="Symbol" w:hAnsi="Symbol" w:hint="default"/>
-      </w:rPr>
-    </w:lvl>
-    <w:lvl w:ilvl="7" w:tplc="080A0003" w:tentative="1">
-      <w:start w:val="1"/>
-      <w:numFmt w:val="bullet"/>
-      <w:lvlText w:val="o"/>
-      <w:lvlJc w:val="left"/>
-      <w:pPr>
-        <w:ind w:left="5760" w:hanging="360"/>
-      </w:pPr>
-      <w:rPr>
-        <w:rFonts w:ascii="Courier New" w:hAnsi="Courier New" w:cs="Courier New" w:hint="default"/>
-      </w:rPr>
-    </w:lvl>
-    <w:lvl w:ilvl="8" w:tplc="080A0005" w:tentative="1">
-      <w:start w:val="1"/>
-      <w:numFmt w:val="bullet"/>
-      <w:lvlText w:val=""/>
-      <w:lvlJc w:val="left"/>
-      <w:pPr>
-        <w:ind w:left="6480" w:hanging="360"/>
-      </w:pPr>
-      <w:rPr>
-        <w:rFonts w:ascii="Wingdings" w:hAnsi="Wingdings" w:hint="default"/>
-      </w:rPr>
-    </w:lvl>
-  </w:abstractNum>
-  <w:abstractNum w:abstractNumId="2" w15:restartNumberingAfterBreak="0">
     <w:nsid w:val="04655906"/>
     <w:multiLevelType w:val="multilevel"/>
     <w:tmpl w:val="C6FAF8C8"/>
@@ -5787,120 +5516,7 @@
       </w:rPr>
     </w:lvl>
   </w:abstractNum>
-  <w:abstractNum w:abstractNumId="3" w15:restartNumberingAfterBreak="0">
-    <w:nsid w:val="05F70226"/>
-    <w:multiLevelType w:val="hybridMultilevel"/>
-    <w:tmpl w:val="21EA6CA4"/>
-    <w:lvl w:ilvl="0" w:tplc="080A0001">
-      <w:start w:val="1"/>
-      <w:numFmt w:val="bullet"/>
-      <w:lvlText w:val=""/>
-      <w:lvlJc w:val="left"/>
-      <w:pPr>
-        <w:ind w:left="720" w:hanging="360"/>
-      </w:pPr>
-      <w:rPr>
-        <w:rFonts w:ascii="Symbol" w:hAnsi="Symbol" w:hint="default"/>
-      </w:rPr>
-    </w:lvl>
-    <w:lvl w:ilvl="1" w:tplc="080A0003" w:tentative="1">
-      <w:start w:val="1"/>
-      <w:numFmt w:val="bullet"/>
-      <w:lvlText w:val="o"/>
-      <w:lvlJc w:val="left"/>
-      <w:pPr>
-        <w:ind w:left="1440" w:hanging="360"/>
-      </w:pPr>
-      <w:rPr>
-        <w:rFonts w:ascii="Courier New" w:hAnsi="Courier New" w:cs="Courier New" w:hint="default"/>
-      </w:rPr>
-    </w:lvl>
-    <w:lvl w:ilvl="2" w:tplc="080A0005" w:tentative="1">
-      <w:start w:val="1"/>
-      <w:numFmt w:val="bullet"/>
-      <w:lvlText w:val=""/>
-      <w:lvlJc w:val="left"/>
-      <w:pPr>
-        <w:ind w:left="2160" w:hanging="360"/>
-      </w:pPr>
-      <w:rPr>
-        <w:rFonts w:ascii="Wingdings" w:hAnsi="Wingdings" w:hint="default"/>
-      </w:rPr>
-    </w:lvl>
-    <w:lvl w:ilvl="3" w:tplc="080A0001" w:tentative="1">
-      <w:start w:val="1"/>
-      <w:numFmt w:val="bullet"/>
-      <w:lvlText w:val=""/>
-      <w:lvlJc w:val="left"/>
-      <w:pPr>
-        <w:ind w:left="2880" w:hanging="360"/>
-      </w:pPr>
-      <w:rPr>
-        <w:rFonts w:ascii="Symbol" w:hAnsi="Symbol" w:hint="default"/>
-      </w:rPr>
-    </w:lvl>
-    <w:lvl w:ilvl="4" w:tplc="080A0003" w:tentative="1">
-      <w:start w:val="1"/>
-      <w:numFmt w:val="bullet"/>
-      <w:lvlText w:val="o"/>
-      <w:lvlJc w:val="left"/>
-      <w:pPr>
-        <w:ind w:left="3600" w:hanging="360"/>
-      </w:pPr>
-      <w:rPr>
-        <w:rFonts w:ascii="Courier New" w:hAnsi="Courier New" w:cs="Courier New" w:hint="default"/>
-      </w:rPr>
-    </w:lvl>
-    <w:lvl w:ilvl="5" w:tplc="080A0005" w:tentative="1">
-      <w:start w:val="1"/>
-      <w:numFmt w:val="bullet"/>
-      <w:lvlText w:val=""/>
-      <w:lvlJc w:val="left"/>
-      <w:pPr>
-        <w:ind w:left="4320" w:hanging="360"/>
-      </w:pPr>
-      <w:rPr>
-        <w:rFonts w:ascii="Wingdings" w:hAnsi="Wingdings" w:hint="default"/>
-      </w:rPr>
-    </w:lvl>
-    <w:lvl w:ilvl="6" w:tplc="080A0001" w:tentative="1">
-      <w:start w:val="1"/>
-      <w:numFmt w:val="bullet"/>
-      <w:lvlText w:val=""/>
-      <w:lvlJc w:val="left"/>
-      <w:pPr>
-        <w:ind w:left="5040" w:hanging="360"/>
-      </w:pPr>
-      <w:rPr>
-        <w:rFonts w:ascii="Symbol" w:hAnsi="Symbol" w:hint="default"/>
-      </w:rPr>
-    </w:lvl>
-    <w:lvl w:ilvl="7" w:tplc="080A0003" w:tentative="1">
-      <w:start w:val="1"/>
-      <w:numFmt w:val="bullet"/>
-      <w:lvlText w:val="o"/>
-      <w:lvlJc w:val="left"/>
-      <w:pPr>
-        <w:ind w:left="5760" w:hanging="360"/>
-      </w:pPr>
-      <w:rPr>
-        <w:rFonts w:ascii="Courier New" w:hAnsi="Courier New" w:cs="Courier New" w:hint="default"/>
-      </w:rPr>
-    </w:lvl>
-    <w:lvl w:ilvl="8" w:tplc="080A0005" w:tentative="1">
-      <w:start w:val="1"/>
-      <w:numFmt w:val="bullet"/>
-      <w:lvlText w:val=""/>
-      <w:lvlJc w:val="left"/>
-      <w:pPr>
-        <w:ind w:left="6480" w:hanging="360"/>
-      </w:pPr>
-      <w:rPr>
-        <w:rFonts w:ascii="Wingdings" w:hAnsi="Wingdings" w:hint="default"/>
-      </w:rPr>
-    </w:lvl>
-  </w:abstractNum>
-  <w:abstractNum w:abstractNumId="4" w15:restartNumberingAfterBreak="0">
+  <w:abstractNum w:abstractNumId="1" w15:restartNumberingAfterBreak="0">
     <w:nsid w:val="0AD12B3D"/>
     <w:multiLevelType w:val="multilevel"/>
     <w:tmpl w:val="691E06E2"/>
@@ -6028,7 +5644,7 @@
       </w:rPr>
     </w:lvl>
   </w:abstractNum>
-  <w:abstractNum w:abstractNumId="5" w15:restartNumberingAfterBreak="0">
+  <w:abstractNum w:abstractNumId="2" w15:restartNumberingAfterBreak="0">
     <w:nsid w:val="0E631A21"/>
     <w:multiLevelType w:val="multilevel"/>
     <w:tmpl w:val="6A385020"/>
@@ -6138,7 +5754,7 @@
       </w:pPr>
     </w:lvl>
   </w:abstractNum>
-  <w:abstractNum w:abstractNumId="6" w15:restartNumberingAfterBreak="0">
+  <w:abstractNum w:abstractNumId="3" w15:restartNumberingAfterBreak="0">
     <w:nsid w:val="0F4A33FA"/>
     <w:multiLevelType w:val="hybridMultilevel"/>
     <w:tmpl w:val="7E26013A"/>
@@ -6225,7 +5841,7 @@
       </w:pPr>
     </w:lvl>
   </w:abstractNum>
-  <w:abstractNum w:abstractNumId="7" w15:restartNumberingAfterBreak="0">
+  <w:abstractNum w:abstractNumId="4" w15:restartNumberingAfterBreak="0">
     <w:nsid w:val="13136FB0"/>
     <w:multiLevelType w:val="hybridMultilevel"/>
     <w:tmpl w:val="F0B285C0"/>
@@ -6338,126 +5954,13 @@
       </w:rPr>
     </w:lvl>
   </w:abstractNum>
-  <w:abstractNum w:abstractNumId="8" w15:restartNumberingAfterBreak="0">
+  <w:abstractNum w:abstractNumId="5" w15:restartNumberingAfterBreak="0">
     <w:nsid w:val="21ED32C1"/>
     <w:multiLevelType w:val="multilevel"/>
     <w:tmpl w:val="39107888"/>
     <w:numStyleLink w:val="NTTBlueBulletList"/>
   </w:abstractNum>
-  <w:abstractNum w:abstractNumId="9" w15:restartNumberingAfterBreak="0">
-    <w:nsid w:val="222A6FC1"/>
-    <w:multiLevelType w:val="hybridMultilevel"/>
-    <w:tmpl w:val="F76A49B8"/>
-    <w:lvl w:ilvl="0" w:tplc="080A0001">
-      <w:start w:val="1"/>
-      <w:numFmt w:val="bullet"/>
-      <w:lvlText w:val=""/>
-      <w:lvlJc w:val="left"/>
-      <w:pPr>
-        <w:ind w:left="720" w:hanging="360"/>
-      </w:pPr>
-      <w:rPr>
-        <w:rFonts w:ascii="Symbol" w:hAnsi="Symbol" w:hint="default"/>
-      </w:rPr>
-    </w:lvl>
-    <w:lvl w:ilvl="1" w:tplc="080A0003" w:tentative="1">
-      <w:start w:val="1"/>
-      <w:numFmt w:val="bullet"/>
-      <w:lvlText w:val="o"/>
-      <w:lvlJc w:val="left"/>
-      <w:pPr>
-        <w:ind w:left="1440" w:hanging="360"/>
-      </w:pPr>
-      <w:rPr>
-        <w:rFonts w:ascii="Courier New" w:hAnsi="Courier New" w:cs="Courier New" w:hint="default"/>
-      </w:rPr>
-    </w:lvl>
-    <w:lvl w:ilvl="2" w:tplc="080A0005" w:tentative="1">
-      <w:start w:val="1"/>
-      <w:numFmt w:val="bullet"/>
-      <w:lvlText w:val=""/>
-      <w:lvlJc w:val="left"/>
-      <w:pPr>
-        <w:ind w:left="2160" w:hanging="360"/>
-      </w:pPr>
-      <w:rPr>
-        <w:rFonts w:ascii="Wingdings" w:hAnsi="Wingdings" w:hint="default"/>
-      </w:rPr>
-    </w:lvl>
-    <w:lvl w:ilvl="3" w:tplc="080A0001" w:tentative="1">
-      <w:start w:val="1"/>
-      <w:numFmt w:val="bullet"/>
-      <w:lvlText w:val=""/>
-      <w:lvlJc w:val="left"/>
-      <w:pPr>
-        <w:ind w:left="2880" w:hanging="360"/>
-      </w:pPr>
-      <w:rPr>
-        <w:rFonts w:ascii="Symbol" w:hAnsi="Symbol" w:hint="default"/>
-      </w:rPr>
-    </w:lvl>
-    <w:lvl w:ilvl="4" w:tplc="080A0003" w:tentative="1">
-      <w:start w:val="1"/>
-      <w:numFmt w:val="bullet"/>
-      <w:lvlText w:val="o"/>
-      <w:lvlJc w:val="left"/>
-      <w:pPr>
-        <w:ind w:left="3600" w:hanging="360"/>
-      </w:pPr>
-      <w:rPr>
-        <w:rFonts w:ascii="Courier New" w:hAnsi="Courier New" w:cs="Courier New" w:hint="default"/>
-      </w:rPr>
-    </w:lvl>
-    <w:lvl w:ilvl="5" w:tplc="080A0005" w:tentative="1">
-      <w:start w:val="1"/>
-      <w:numFmt w:val="bullet"/>
-      <w:lvlText w:val=""/>
-      <w:lvlJc w:val="left"/>
-      <w:pPr>
-        <w:ind w:left="4320" w:hanging="360"/>
-      </w:pPr>
-      <w:rPr>
-        <w:rFonts w:ascii="Wingdings" w:hAnsi="Wingdings" w:hint="default"/>
-      </w:rPr>
-    </w:lvl>
-    <w:lvl w:ilvl="6" w:tplc="080A0001" w:tentative="1">
-      <w:start w:val="1"/>
-      <w:numFmt w:val="bullet"/>
-      <w:lvlText w:val=""/>
-      <w:lvlJc w:val="left"/>
-      <w:pPr>
-        <w:ind w:left="5040" w:hanging="360"/>
-      </w:pPr>
-      <w:rPr>
-        <w:rFonts w:ascii="Symbol" w:hAnsi="Symbol" w:hint="default"/>
-      </w:rPr>
-    </w:lvl>
-    <w:lvl w:ilvl="7" w:tplc="080A0003" w:tentative="1">
-      <w:start w:val="1"/>
-      <w:numFmt w:val="bullet"/>
-      <w:lvlText w:val="o"/>
-      <w:lvlJc w:val="left"/>
-      <w:pPr>
-        <w:ind w:left="5760" w:hanging="360"/>
-      </w:pPr>
-      <w:rPr>
-        <w:rFonts w:ascii="Courier New" w:hAnsi="Courier New" w:cs="Courier New" w:hint="default"/>
-      </w:rPr>
-    </w:lvl>
-    <w:lvl w:ilvl="8" w:tplc="080A0005" w:tentative="1">
-      <w:start w:val="1"/>
-      <w:numFmt w:val="bullet"/>
-      <w:lvlText w:val=""/>
-      <w:lvlJc w:val="left"/>
-      <w:pPr>
-        <w:ind w:left="6480" w:hanging="360"/>
-      </w:pPr>
-      <w:rPr>
-        <w:rFonts w:ascii="Wingdings" w:hAnsi="Wingdings" w:hint="default"/>
-      </w:rPr>
-    </w:lvl>
-  </w:abstractNum>
-  <w:abstractNum w:abstractNumId="10" w15:restartNumberingAfterBreak="0">
+  <w:abstractNum w:abstractNumId="6" w15:restartNumberingAfterBreak="0">
     <w:nsid w:val="253F1B30"/>
     <w:multiLevelType w:val="hybridMultilevel"/>
     <w:tmpl w:val="79B45E56"/>
@@ -6570,7 +6073,7 @@
       </w:rPr>
     </w:lvl>
   </w:abstractNum>
-  <w:abstractNum w:abstractNumId="11" w15:restartNumberingAfterBreak="0">
+  <w:abstractNum w:abstractNumId="7" w15:restartNumberingAfterBreak="0">
     <w:nsid w:val="277D2AE3"/>
     <w:multiLevelType w:val="multilevel"/>
     <w:tmpl w:val="39107888"/>
@@ -6767,13 +6270,13 @@
       </w:rPr>
     </w:lvl>
   </w:abstractNum>
-  <w:abstractNum w:abstractNumId="12" w15:restartNumberingAfterBreak="0">
+  <w:abstractNum w:abstractNumId="8" w15:restartNumberingAfterBreak="0">
     <w:nsid w:val="28864DF7"/>
     <w:multiLevelType w:val="multilevel"/>
     <w:tmpl w:val="771046AA"/>
     <w:numStyleLink w:val="NTTBlueTableBulletList"/>
   </w:abstractNum>
-  <w:abstractNum w:abstractNumId="13" w15:restartNumberingAfterBreak="0">
+  <w:abstractNum w:abstractNumId="9" w15:restartNumberingAfterBreak="0">
     <w:nsid w:val="2B587E8C"/>
     <w:multiLevelType w:val="multilevel"/>
     <w:tmpl w:val="680CEBF8"/>
@@ -6979,7 +6482,7 @@
       </w:rPr>
     </w:lvl>
   </w:abstractNum>
-  <w:abstractNum w:abstractNumId="14" w15:restartNumberingAfterBreak="0">
+  <w:abstractNum w:abstractNumId="10" w15:restartNumberingAfterBreak="0">
     <w:nsid w:val="2C451A45"/>
     <w:multiLevelType w:val="hybridMultilevel"/>
     <w:tmpl w:val="EA0696DC"/>
@@ -7066,7 +6569,7 @@
       </w:pPr>
     </w:lvl>
   </w:abstractNum>
-  <w:abstractNum w:abstractNumId="15" w15:restartNumberingAfterBreak="0">
+  <w:abstractNum w:abstractNumId="11" w15:restartNumberingAfterBreak="0">
     <w:nsid w:val="30BD799C"/>
     <w:multiLevelType w:val="hybridMultilevel"/>
     <w:tmpl w:val="5666DAF0"/>
@@ -7152,7 +6655,7 @@
       </w:pPr>
     </w:lvl>
   </w:abstractNum>
-  <w:abstractNum w:abstractNumId="16" w15:restartNumberingAfterBreak="0">
+  <w:abstractNum w:abstractNumId="12" w15:restartNumberingAfterBreak="0">
     <w:nsid w:val="316E0CB0"/>
     <w:multiLevelType w:val="hybridMultilevel"/>
     <w:tmpl w:val="CB02AECC"/>
@@ -7265,7 +6768,7 @@
       </w:rPr>
     </w:lvl>
   </w:abstractNum>
-  <w:abstractNum w:abstractNumId="17" w15:restartNumberingAfterBreak="0">
+  <w:abstractNum w:abstractNumId="13" w15:restartNumberingAfterBreak="0">
     <w:nsid w:val="322165AD"/>
     <w:multiLevelType w:val="multilevel"/>
     <w:tmpl w:val="5DF88DE2"/>
@@ -7386,7 +6889,7 @@
       </w:rPr>
     </w:lvl>
   </w:abstractNum>
-  <w:abstractNum w:abstractNumId="18" w15:restartNumberingAfterBreak="0">
+  <w:abstractNum w:abstractNumId="14" w15:restartNumberingAfterBreak="0">
     <w:nsid w:val="323E26EB"/>
     <w:multiLevelType w:val="multilevel"/>
     <w:tmpl w:val="8C6CA74E"/>
@@ -7582,7 +7085,7 @@
       </w:rPr>
     </w:lvl>
   </w:abstractNum>
-  <w:abstractNum w:abstractNumId="19" w15:restartNumberingAfterBreak="0">
+  <w:abstractNum w:abstractNumId="15" w15:restartNumberingAfterBreak="0">
     <w:nsid w:val="32A47F3E"/>
     <w:multiLevelType w:val="multilevel"/>
     <w:tmpl w:val="169263BC"/>
@@ -7779,7 +7282,7 @@
       </w:rPr>
     </w:lvl>
   </w:abstractNum>
-  <w:abstractNum w:abstractNumId="20" w15:restartNumberingAfterBreak="0">
+  <w:abstractNum w:abstractNumId="16" w15:restartNumberingAfterBreak="0">
     <w:nsid w:val="474B42B1"/>
     <w:multiLevelType w:val="multilevel"/>
     <w:tmpl w:val="2E501B8C"/>
@@ -7967,7 +7470,7 @@
       </w:rPr>
     </w:lvl>
   </w:abstractNum>
-  <w:abstractNum w:abstractNumId="21" w15:restartNumberingAfterBreak="0">
+  <w:abstractNum w:abstractNumId="17" w15:restartNumberingAfterBreak="0">
     <w:nsid w:val="4A2B0949"/>
     <w:multiLevelType w:val="multilevel"/>
     <w:tmpl w:val="7D4A1AC0"/>
@@ -8118,120 +7621,7 @@
       </w:rPr>
     </w:lvl>
   </w:abstractNum>
-  <w:abstractNum w:abstractNumId="22" w15:restartNumberingAfterBreak="0">
-    <w:nsid w:val="4D103283"/>
-    <w:multiLevelType w:val="hybridMultilevel"/>
-    <w:tmpl w:val="0B68D11C"/>
-    <w:lvl w:ilvl="0" w:tplc="080A0001">
-      <w:start w:val="1"/>
-      <w:numFmt w:val="bullet"/>
-      <w:lvlText w:val=""/>
-      <w:lvlJc w:val="left"/>
-      <w:pPr>
-        <w:ind w:left="720" w:hanging="360"/>
-      </w:pPr>
-      <w:rPr>
-        <w:rFonts w:ascii="Symbol" w:hAnsi="Symbol" w:hint="default"/>
-      </w:rPr>
-    </w:lvl>
-    <w:lvl w:ilvl="1" w:tplc="080A0003" w:tentative="1">
-      <w:start w:val="1"/>
-      <w:numFmt w:val="bullet"/>
-      <w:lvlText w:val="o"/>
-      <w:lvlJc w:val="left"/>
-      <w:pPr>
-        <w:ind w:left="1440" w:hanging="360"/>
-      </w:pPr>
-      <w:rPr>
-        <w:rFonts w:ascii="Courier New" w:hAnsi="Courier New" w:cs="Courier New" w:hint="default"/>
-      </w:rPr>
-    </w:lvl>
-    <w:lvl w:ilvl="2" w:tplc="080A0005" w:tentative="1">
-      <w:start w:val="1"/>
-      <w:numFmt w:val="bullet"/>
-      <w:lvlText w:val=""/>
-      <w:lvlJc w:val="left"/>
-      <w:pPr>
-        <w:ind w:left="2160" w:hanging="360"/>
-      </w:pPr>
-      <w:rPr>
-        <w:rFonts w:ascii="Wingdings" w:hAnsi="Wingdings" w:hint="default"/>
-      </w:rPr>
-    </w:lvl>
-    <w:lvl w:ilvl="3" w:tplc="080A0001" w:tentative="1">
-      <w:start w:val="1"/>
-      <w:numFmt w:val="bullet"/>
-      <w:lvlText w:val=""/>
-      <w:lvlJc w:val="left"/>
-      <w:pPr>
-        <w:ind w:left="2880" w:hanging="360"/>
-      </w:pPr>
-      <w:rPr>
-        <w:rFonts w:ascii="Symbol" w:hAnsi="Symbol" w:hint="default"/>
-      </w:rPr>
-    </w:lvl>
-    <w:lvl w:ilvl="4" w:tplc="080A0003" w:tentative="1">
-      <w:start w:val="1"/>
-      <w:numFmt w:val="bullet"/>
-      <w:lvlText w:val="o"/>
-      <w:lvlJc w:val="left"/>
-      <w:pPr>
-        <w:ind w:left="3600" w:hanging="360"/>
-      </w:pPr>
-      <w:rPr>
-        <w:rFonts w:ascii="Courier New" w:hAnsi="Courier New" w:cs="Courier New" w:hint="default"/>
-      </w:rPr>
-    </w:lvl>
-    <w:lvl w:ilvl="5" w:tplc="080A0005" w:tentative="1">
-      <w:start w:val="1"/>
-      <w:numFmt w:val="bullet"/>
-      <w:lvlText w:val=""/>
-      <w:lvlJc w:val="left"/>
-      <w:pPr>
-        <w:ind w:left="4320" w:hanging="360"/>
-      </w:pPr>
-      <w:rPr>
-        <w:rFonts w:ascii="Wingdings" w:hAnsi="Wingdings" w:hint="default"/>
-      </w:rPr>
-    </w:lvl>
-    <w:lvl w:ilvl="6" w:tplc="080A0001" w:tentative="1">
-      <w:start w:val="1"/>
-      <w:numFmt w:val="bullet"/>
-      <w:lvlText w:val=""/>
-      <w:lvlJc w:val="left"/>
-      <w:pPr>
-        <w:ind w:left="5040" w:hanging="360"/>
-      </w:pPr>
-      <w:rPr>
-        <w:rFonts w:ascii="Symbol" w:hAnsi="Symbol" w:hint="default"/>
-      </w:rPr>
-    </w:lvl>
-    <w:lvl w:ilvl="7" w:tplc="080A0003" w:tentative="1">
-      <w:start w:val="1"/>
-      <w:numFmt w:val="bullet"/>
-      <w:lvlText w:val="o"/>
-      <w:lvlJc w:val="left"/>
-      <w:pPr>
-        <w:ind w:left="5760" w:hanging="360"/>
-      </w:pPr>
-      <w:rPr>
-        <w:rFonts w:ascii="Courier New" w:hAnsi="Courier New" w:cs="Courier New" w:hint="default"/>
-      </w:rPr>
-    </w:lvl>
-    <w:lvl w:ilvl="8" w:tplc="080A0005" w:tentative="1">
-      <w:start w:val="1"/>
-      <w:numFmt w:val="bullet"/>
-      <w:lvlText w:val=""/>
-      <w:lvlJc w:val="left"/>
-      <w:pPr>
-        <w:ind w:left="6480" w:hanging="360"/>
-      </w:pPr>
-      <w:rPr>
-        <w:rFonts w:ascii="Wingdings" w:hAnsi="Wingdings" w:hint="default"/>
-      </w:rPr>
-    </w:lvl>
-  </w:abstractNum>
-  <w:abstractNum w:abstractNumId="23" w15:restartNumberingAfterBreak="0">
+  <w:abstractNum w:abstractNumId="18" w15:restartNumberingAfterBreak="0">
     <w:nsid w:val="4F194436"/>
     <w:multiLevelType w:val="multilevel"/>
     <w:tmpl w:val="C832ACC0"/>
@@ -8347,7 +7737,7 @@
       </w:rPr>
     </w:lvl>
   </w:abstractNum>
-  <w:abstractNum w:abstractNumId="24" w15:restartNumberingAfterBreak="0">
+  <w:abstractNum w:abstractNumId="19" w15:restartNumberingAfterBreak="0">
     <w:nsid w:val="5B192594"/>
     <w:multiLevelType w:val="multilevel"/>
     <w:tmpl w:val="6456C98A"/>
@@ -8496,7 +7886,7 @@
       </w:rPr>
     </w:lvl>
   </w:abstractNum>
-  <w:abstractNum w:abstractNumId="25" w15:restartNumberingAfterBreak="0">
+  <w:abstractNum w:abstractNumId="20" w15:restartNumberingAfterBreak="0">
     <w:nsid w:val="5EA35D47"/>
     <w:multiLevelType w:val="multilevel"/>
     <w:tmpl w:val="6D02664C"/>
@@ -8687,7 +8077,7 @@
       </w:rPr>
     </w:lvl>
   </w:abstractNum>
-  <w:abstractNum w:abstractNumId="26" w15:restartNumberingAfterBreak="0">
+  <w:abstractNum w:abstractNumId="21" w15:restartNumberingAfterBreak="0">
     <w:nsid w:val="64A85724"/>
     <w:multiLevelType w:val="multilevel"/>
     <w:tmpl w:val="771046AA"/>
@@ -8883,7 +8273,7 @@
       </w:rPr>
     </w:lvl>
   </w:abstractNum>
-  <w:abstractNum w:abstractNumId="27" w15:restartNumberingAfterBreak="0">
+  <w:abstractNum w:abstractNumId="22" w15:restartNumberingAfterBreak="0">
     <w:nsid w:val="6A2026CD"/>
     <w:multiLevelType w:val="multilevel"/>
     <w:tmpl w:val="D2080C92"/>
@@ -9041,120 +8431,7 @@
       </w:rPr>
     </w:lvl>
   </w:abstractNum>
-  <w:abstractNum w:abstractNumId="28" w15:restartNumberingAfterBreak="0">
-    <w:nsid w:val="6F2F30A7"/>
-    <w:multiLevelType w:val="hybridMultilevel"/>
-    <w:tmpl w:val="722A2A2E"/>
-    <w:lvl w:ilvl="0" w:tplc="04090001">
-      <w:start w:val="1"/>
-      <w:numFmt w:val="bullet"/>
-      <w:lvlText w:val=""/>
-      <w:lvlJc w:val="left"/>
-      <w:pPr>
-        <w:ind w:left="720" w:hanging="360"/>
-      </w:pPr>
-      <w:rPr>
-        <w:rFonts w:ascii="Symbol" w:hAnsi="Symbol" w:hint="default"/>
-      </w:rPr>
-    </w:lvl>
-    <w:lvl w:ilvl="1" w:tplc="04090003" w:tentative="1">
-      <w:start w:val="1"/>
-      <w:numFmt w:val="bullet"/>
-      <w:lvlText w:val="o"/>
-      <w:lvlJc w:val="left"/>
-      <w:pPr>
-        <w:ind w:left="1440" w:hanging="360"/>
-      </w:pPr>
-      <w:rPr>
-        <w:rFonts w:ascii="Courier New" w:hAnsi="Courier New" w:cs="Courier New" w:hint="default"/>
-      </w:rPr>
-    </w:lvl>
-    <w:lvl w:ilvl="2" w:tplc="04090005" w:tentative="1">
-      <w:start w:val="1"/>
-      <w:numFmt w:val="bullet"/>
-      <w:lvlText w:val=""/>
-      <w:lvlJc w:val="left"/>
-      <w:pPr>
-        <w:ind w:left="2160" w:hanging="360"/>
-      </w:pPr>
-      <w:rPr>
-        <w:rFonts w:ascii="Wingdings" w:hAnsi="Wingdings" w:hint="default"/>
-      </w:rPr>
-    </w:lvl>
-    <w:lvl w:ilvl="3" w:tplc="04090001" w:tentative="1">
-      <w:start w:val="1"/>
-      <w:numFmt w:val="bullet"/>
-      <w:lvlText w:val=""/>
-      <w:lvlJc w:val="left"/>
-      <w:pPr>
-        <w:ind w:left="2880" w:hanging="360"/>
-      </w:pPr>
-      <w:rPr>
-        <w:rFonts w:ascii="Symbol" w:hAnsi="Symbol" w:hint="default"/>
-      </w:rPr>
-    </w:lvl>
-    <w:lvl w:ilvl="4" w:tplc="04090003" w:tentative="1">
-      <w:start w:val="1"/>
-      <w:numFmt w:val="bullet"/>
-      <w:lvlText w:val="o"/>
-      <w:lvlJc w:val="left"/>
-      <w:pPr>
-        <w:ind w:left="3600" w:hanging="360"/>
-      </w:pPr>
-      <w:rPr>
-        <w:rFonts w:ascii="Courier New" w:hAnsi="Courier New" w:cs="Courier New" w:hint="default"/>
-      </w:rPr>
-    </w:lvl>
-    <w:lvl w:ilvl="5" w:tplc="04090005" w:tentative="1">
-      <w:start w:val="1"/>
-      <w:numFmt w:val="bullet"/>
-      <w:lvlText w:val=""/>
-      <w:lvlJc w:val="left"/>
-      <w:pPr>
-        <w:ind w:left="4320" w:hanging="360"/>
-      </w:pPr>
-      <w:rPr>
-        <w:rFonts w:ascii="Wingdings" w:hAnsi="Wingdings" w:hint="default"/>
-      </w:rPr>
-    </w:lvl>
-    <w:lvl w:ilvl="6" w:tplc="04090001" w:tentative="1">
-      <w:start w:val="1"/>
-      <w:numFmt w:val="bullet"/>
-      <w:lvlText w:val=""/>
-      <w:lvlJc w:val="left"/>
-      <w:pPr>
-        <w:ind w:left="5040" w:hanging="360"/>
-      </w:pPr>
-      <w:rPr>
-        <w:rFonts w:ascii="Symbol" w:hAnsi="Symbol" w:hint="default"/>
-      </w:rPr>
-    </w:lvl>
-    <w:lvl w:ilvl="7" w:tplc="04090003" w:tentative="1">
-      <w:start w:val="1"/>
-      <w:numFmt w:val="bullet"/>
-      <w:lvlText w:val="o"/>
-      <w:lvlJc w:val="left"/>
-      <w:pPr>
-        <w:ind w:left="5760" w:hanging="360"/>
-      </w:pPr>
-      <w:rPr>
-        <w:rFonts w:ascii="Courier New" w:hAnsi="Courier New" w:cs="Courier New" w:hint="default"/>
-      </w:rPr>
-    </w:lvl>
-    <w:lvl w:ilvl="8" w:tplc="04090005" w:tentative="1">
-      <w:start w:val="1"/>
-      <w:numFmt w:val="bullet"/>
-      <w:lvlText w:val=""/>
-      <w:lvlJc w:val="left"/>
-      <w:pPr>
-        <w:ind w:left="6480" w:hanging="360"/>
-      </w:pPr>
-      <w:rPr>
-        <w:rFonts w:ascii="Wingdings" w:hAnsi="Wingdings" w:hint="default"/>
-      </w:rPr>
-    </w:lvl>
-  </w:abstractNum>
-  <w:abstractNum w:abstractNumId="29" w15:restartNumberingAfterBreak="0">
+  <w:abstractNum w:abstractNumId="23" w15:restartNumberingAfterBreak="0">
     <w:nsid w:val="70BC1A2A"/>
     <w:multiLevelType w:val="hybridMultilevel"/>
     <w:tmpl w:val="E2407366"/>
@@ -9241,120 +8518,7 @@
       </w:pPr>
     </w:lvl>
   </w:abstractNum>
-  <w:abstractNum w:abstractNumId="30" w15:restartNumberingAfterBreak="0">
-    <w:nsid w:val="731A0552"/>
-    <w:multiLevelType w:val="hybridMultilevel"/>
-    <w:tmpl w:val="A83CA910"/>
-    <w:lvl w:ilvl="0" w:tplc="080A0001">
-      <w:start w:val="1"/>
-      <w:numFmt w:val="bullet"/>
-      <w:lvlText w:val=""/>
-      <w:lvlJc w:val="left"/>
-      <w:pPr>
-        <w:ind w:left="720" w:hanging="360"/>
-      </w:pPr>
-      <w:rPr>
-        <w:rFonts w:ascii="Symbol" w:hAnsi="Symbol" w:hint="default"/>
-      </w:rPr>
-    </w:lvl>
-    <w:lvl w:ilvl="1" w:tplc="080A0003" w:tentative="1">
-      <w:start w:val="1"/>
-      <w:numFmt w:val="bullet"/>
-      <w:lvlText w:val="o"/>
-      <w:lvlJc w:val="left"/>
-      <w:pPr>
-        <w:ind w:left="1440" w:hanging="360"/>
-      </w:pPr>
-      <w:rPr>
-        <w:rFonts w:ascii="Courier New" w:hAnsi="Courier New" w:cs="Courier New" w:hint="default"/>
-      </w:rPr>
-    </w:lvl>
-    <w:lvl w:ilvl="2" w:tplc="080A0005" w:tentative="1">
-      <w:start w:val="1"/>
-      <w:numFmt w:val="bullet"/>
-      <w:lvlText w:val=""/>
-      <w:lvlJc w:val="left"/>
-      <w:pPr>
-        <w:ind w:left="2160" w:hanging="360"/>
-      </w:pPr>
-      <w:rPr>
-        <w:rFonts w:ascii="Wingdings" w:hAnsi="Wingdings" w:hint="default"/>
-      </w:rPr>
-    </w:lvl>
-    <w:lvl w:ilvl="3" w:tplc="080A0001" w:tentative="1">
-      <w:start w:val="1"/>
-      <w:numFmt w:val="bullet"/>
-      <w:lvlText w:val=""/>
-      <w:lvlJc w:val="left"/>
-      <w:pPr>
-        <w:ind w:left="2880" w:hanging="360"/>
-      </w:pPr>
-      <w:rPr>
-        <w:rFonts w:ascii="Symbol" w:hAnsi="Symbol" w:hint="default"/>
-      </w:rPr>
-    </w:lvl>
-    <w:lvl w:ilvl="4" w:tplc="080A0003" w:tentative="1">
-      <w:start w:val="1"/>
-      <w:numFmt w:val="bullet"/>
-      <w:lvlText w:val="o"/>
-      <w:lvlJc w:val="left"/>
-      <w:pPr>
-        <w:ind w:left="3600" w:hanging="360"/>
-      </w:pPr>
-      <w:rPr>
-        <w:rFonts w:ascii="Courier New" w:hAnsi="Courier New" w:cs="Courier New" w:hint="default"/>
-      </w:rPr>
-    </w:lvl>
-    <w:lvl w:ilvl="5" w:tplc="080A0005" w:tentative="1">
-      <w:start w:val="1"/>
-      <w:numFmt w:val="bullet"/>
-      <w:lvlText w:val=""/>
-      <w:lvlJc w:val="left"/>
-      <w:pPr>
-        <w:ind w:left="4320" w:hanging="360"/>
-      </w:pPr>
-      <w:rPr>
-        <w:rFonts w:ascii="Wingdings" w:hAnsi="Wingdings" w:hint="default"/>
-      </w:rPr>
-    </w:lvl>
-    <w:lvl w:ilvl="6" w:tplc="080A0001" w:tentative="1">
-      <w:start w:val="1"/>
-      <w:numFmt w:val="bullet"/>
-      <w:lvlText w:val=""/>
-      <w:lvlJc w:val="left"/>
-      <w:pPr>
-        <w:ind w:left="5040" w:hanging="360"/>
-      </w:pPr>
-      <w:rPr>
-        <w:rFonts w:ascii="Symbol" w:hAnsi="Symbol" w:hint="default"/>
-      </w:rPr>
-    </w:lvl>
-    <w:lvl w:ilvl="7" w:tplc="080A0003" w:tentative="1">
-      <w:start w:val="1"/>
-      <w:numFmt w:val="bullet"/>
-      <w:lvlText w:val="o"/>
-      <w:lvlJc w:val="left"/>
-      <w:pPr>
-        <w:ind w:left="5760" w:hanging="360"/>
-      </w:pPr>
-      <w:rPr>
-        <w:rFonts w:ascii="Courier New" w:hAnsi="Courier New" w:cs="Courier New" w:hint="default"/>
-      </w:rPr>
-    </w:lvl>
-    <w:lvl w:ilvl="8" w:tplc="080A0005" w:tentative="1">
-      <w:start w:val="1"/>
-      <w:numFmt w:val="bullet"/>
-      <w:lvlText w:val=""/>
-      <w:lvlJc w:val="left"/>
-      <w:pPr>
-        <w:ind w:left="6480" w:hanging="360"/>
-      </w:pPr>
-      <w:rPr>
-        <w:rFonts w:ascii="Wingdings" w:hAnsi="Wingdings" w:hint="default"/>
-      </w:rPr>
-    </w:lvl>
-  </w:abstractNum>
-  <w:abstractNum w:abstractNumId="31" w15:restartNumberingAfterBreak="0">
+  <w:abstractNum w:abstractNumId="24" w15:restartNumberingAfterBreak="0">
     <w:nsid w:val="78DE3FC2"/>
     <w:multiLevelType w:val="hybridMultilevel"/>
     <w:tmpl w:val="5F468762"/>
@@ -9467,7 +8631,7 @@
       </w:rPr>
     </w:lvl>
   </w:abstractNum>
-  <w:abstractNum w:abstractNumId="32" w15:restartNumberingAfterBreak="0">
+  <w:abstractNum w:abstractNumId="25" w15:restartNumberingAfterBreak="0">
     <w:nsid w:val="7A2109DD"/>
     <w:multiLevelType w:val="hybridMultilevel"/>
     <w:tmpl w:val="4E64AA0A"/>
@@ -9580,7 +8744,7 @@
       </w:rPr>
     </w:lvl>
   </w:abstractNum>
-  <w:abstractNum w:abstractNumId="33" w15:restartNumberingAfterBreak="0">
+  <w:abstractNum w:abstractNumId="26" w15:restartNumberingAfterBreak="0">
     <w:nsid w:val="7E7C3026"/>
     <w:multiLevelType w:val="multilevel"/>
     <w:tmpl w:val="E8E4266C"/>
@@ -9726,16 +8890,16 @@
     </w:lvl>
   </w:abstractNum>
   <w:num w:numId="1" w16cid:durableId="1107852680">
-    <w:abstractNumId w:val="14"/>
+    <w:abstractNumId w:val="10"/>
   </w:num>
   <w:num w:numId="2" w16cid:durableId="1215698329">
-    <w:abstractNumId w:val="23"/>
+    <w:abstractNumId w:val="18"/>
   </w:num>
   <w:num w:numId="3" w16cid:durableId="902790624">
-    <w:abstractNumId w:val="17"/>
+    <w:abstractNumId w:val="13"/>
   </w:num>
   <w:num w:numId="4" w16cid:durableId="1093235555">
-    <w:abstractNumId w:val="17"/>
+    <w:abstractNumId w:val="13"/>
     <w:lvlOverride w:ilvl="0">
       <w:lvl w:ilvl="0">
         <w:start w:val="1"/>
@@ -9793,10 +8957,10 @@
     </w:lvlOverride>
   </w:num>
   <w:num w:numId="5" w16cid:durableId="1741126396">
-    <w:abstractNumId w:val="11"/>
+    <w:abstractNumId w:val="7"/>
   </w:num>
   <w:num w:numId="6" w16cid:durableId="1196692695">
-    <w:abstractNumId w:val="8"/>
+    <w:abstractNumId w:val="5"/>
     <w:lvlOverride w:ilvl="0">
       <w:lvl w:ilvl="0">
         <w:start w:val="1"/>
@@ -9934,10 +9098,10 @@
     </w:lvlOverride>
   </w:num>
   <w:num w:numId="7" w16cid:durableId="1094739228">
-    <w:abstractNumId w:val="26"/>
+    <w:abstractNumId w:val="21"/>
   </w:num>
   <w:num w:numId="8" w16cid:durableId="775369593">
-    <w:abstractNumId w:val="12"/>
+    <w:abstractNumId w:val="8"/>
     <w:lvlOverride w:ilvl="0">
       <w:lvl w:ilvl="0">
         <w:start w:val="1"/>
@@ -10075,16 +9239,16 @@
     </w:lvlOverride>
   </w:num>
   <w:num w:numId="9" w16cid:durableId="1049841814">
+    <w:abstractNumId w:val="15"/>
+  </w:num>
+  <w:num w:numId="10" w16cid:durableId="1218661965">
     <w:abstractNumId w:val="19"/>
   </w:num>
-  <w:num w:numId="10" w16cid:durableId="1218661965">
-    <w:abstractNumId w:val="24"/>
-  </w:num>
   <w:num w:numId="11" w16cid:durableId="347412455">
-    <w:abstractNumId w:val="33"/>
+    <w:abstractNumId w:val="26"/>
   </w:num>
   <w:num w:numId="12" w16cid:durableId="1882672173">
-    <w:abstractNumId w:val="19"/>
+    <w:abstractNumId w:val="15"/>
     <w:lvlOverride w:ilvl="0">
       <w:lvl w:ilvl="0">
         <w:start w:val="1"/>
@@ -10102,7 +9266,7 @@
     </w:lvlOverride>
   </w:num>
   <w:num w:numId="13" w16cid:durableId="1496800376">
-    <w:abstractNumId w:val="24"/>
+    <w:abstractNumId w:val="19"/>
     <w:lvlOverride w:ilvl="0">
       <w:lvl w:ilvl="0">
         <w:start w:val="1"/>
@@ -10217,7 +9381,7 @@
     </w:lvlOverride>
   </w:num>
   <w:num w:numId="14" w16cid:durableId="976255163">
-    <w:abstractNumId w:val="33"/>
+    <w:abstractNumId w:val="26"/>
     <w:lvlOverride w:ilvl="0">
       <w:lvl w:ilvl="0">
         <w:start w:val="1"/>
@@ -10365,16 +9529,16 @@
     </w:lvlOverride>
   </w:num>
   <w:num w:numId="15" w16cid:durableId="1685861503">
-    <w:abstractNumId w:val="18"/>
+    <w:abstractNumId w:val="14"/>
   </w:num>
   <w:num w:numId="16" w16cid:durableId="913511098">
+    <w:abstractNumId w:val="16"/>
+  </w:num>
+  <w:num w:numId="17" w16cid:durableId="689137048">
     <w:abstractNumId w:val="20"/>
   </w:num>
-  <w:num w:numId="17" w16cid:durableId="689137048">
-    <w:abstractNumId w:val="25"/>
-  </w:num>
   <w:num w:numId="18" w16cid:durableId="89932287">
-    <w:abstractNumId w:val="25"/>
+    <w:abstractNumId w:val="20"/>
     <w:lvlOverride w:ilvl="0">
       <w:lvl w:ilvl="0">
         <w:numFmt w:val="decimal"/>
@@ -10414,58 +9578,28 @@
     </w:lvlOverride>
   </w:num>
   <w:num w:numId="19" w16cid:durableId="864438166">
-    <w:abstractNumId w:val="5"/>
+    <w:abstractNumId w:val="2"/>
   </w:num>
   <w:num w:numId="20" w16cid:durableId="1573076371">
-    <w:abstractNumId w:val="29"/>
+    <w:abstractNumId w:val="23"/>
   </w:num>
   <w:num w:numId="21" w16cid:durableId="527986321">
-    <w:abstractNumId w:val="6"/>
+    <w:abstractNumId w:val="3"/>
   </w:num>
   <w:num w:numId="22" w16cid:durableId="1001859300">
-    <w:abstractNumId w:val="2"/>
+    <w:abstractNumId w:val="0"/>
   </w:num>
   <w:num w:numId="23" w16cid:durableId="1250456801">
-    <w:abstractNumId w:val="13"/>
+    <w:abstractNumId w:val="9"/>
   </w:num>
-  <w:num w:numId="24" w16cid:durableId="1244995925">
-    <w:abstractNumId w:val="13"/>
-    <w:lvlOverride w:ilvl="0">
-      <w:startOverride w:val="1"/>
-    </w:lvlOverride>
-    <w:lvlOverride w:ilvl="1">
-      <w:startOverride w:val="1"/>
-    </w:lvlOverride>
-    <w:lvlOverride w:ilvl="2">
-      <w:startOverride w:val="1"/>
-    </w:lvlOverride>
-    <w:lvlOverride w:ilvl="3">
-      <w:startOverride w:val="1"/>
-    </w:lvlOverride>
-    <w:lvlOverride w:ilvl="4">
-      <w:startOverride w:val="1"/>
-    </w:lvlOverride>
-    <w:lvlOverride w:ilvl="5">
-      <w:startOverride w:val="1"/>
-    </w:lvlOverride>
-    <w:lvlOverride w:ilvl="6">
-      <w:startOverride w:val="1"/>
-    </w:lvlOverride>
-    <w:lvlOverride w:ilvl="7">
-      <w:startOverride w:val="1"/>
-    </w:lvlOverride>
-    <w:lvlOverride w:ilvl="8">
-      <w:startOverride w:val="1"/>
-    </w:lvlOverride>
+  <w:num w:numId="24" w16cid:durableId="1722051722">
+    <w:abstractNumId w:val="17"/>
   </w:num>
-  <w:num w:numId="25" w16cid:durableId="1722051722">
-    <w:abstractNumId w:val="21"/>
+  <w:num w:numId="25" w16cid:durableId="846137730">
+    <w:abstractNumId w:val="22"/>
   </w:num>
-  <w:num w:numId="26" w16cid:durableId="846137730">
-    <w:abstractNumId w:val="27"/>
-  </w:num>
-  <w:num w:numId="27" w16cid:durableId="277639401">
-    <w:abstractNumId w:val="21"/>
+  <w:num w:numId="26" w16cid:durableId="277639401">
+    <w:abstractNumId w:val="17"/>
     <w:lvlOverride w:ilvl="0">
       <w:lvl w:ilvl="0">
         <w:numFmt w:val="decimal"/>
@@ -10521,8 +9655,8 @@
       </w:lvl>
     </w:lvlOverride>
   </w:num>
-  <w:num w:numId="28" w16cid:durableId="1579822831">
-    <w:abstractNumId w:val="27"/>
+  <w:num w:numId="27" w16cid:durableId="1579822831">
+    <w:abstractNumId w:val="22"/>
     <w:lvlOverride w:ilvl="0">
       <w:lvl w:ilvl="0">
         <w:start w:val="1"/>
@@ -10590,76 +9724,28 @@
       </w:lvl>
     </w:lvlOverride>
   </w:num>
-  <w:num w:numId="29" w16cid:durableId="1085684408">
+  <w:num w:numId="28" w16cid:durableId="1085684408">
+    <w:abstractNumId w:val="1"/>
+  </w:num>
+  <w:num w:numId="29" w16cid:durableId="1372270554">
+    <w:abstractNumId w:val="24"/>
+  </w:num>
+  <w:num w:numId="30" w16cid:durableId="1816482591">
     <w:abstractNumId w:val="4"/>
   </w:num>
-  <w:num w:numId="30" w16cid:durableId="373694254">
-    <w:abstractNumId w:val="28"/>
+  <w:num w:numId="31" w16cid:durableId="1516457938">
+    <w:abstractNumId w:val="25"/>
   </w:num>
-  <w:num w:numId="31" w16cid:durableId="1536499407">
-    <w:abstractNumId w:val="13"/>
+  <w:num w:numId="32" w16cid:durableId="1231425337">
+    <w:abstractNumId w:val="6"/>
   </w:num>
-  <w:num w:numId="32" w16cid:durableId="1372270554">
-    <w:abstractNumId w:val="31"/>
+  <w:num w:numId="33" w16cid:durableId="176165479">
+    <w:abstractNumId w:val="12"/>
   </w:num>
-  <w:num w:numId="33" w16cid:durableId="1816482591">
-    <w:abstractNumId w:val="7"/>
+  <w:num w:numId="34" w16cid:durableId="761725539">
+    <w:abstractNumId w:val="11"/>
   </w:num>
-  <w:num w:numId="34" w16cid:durableId="26687671">
-    <w:abstractNumId w:val="3"/>
-  </w:num>
-  <w:num w:numId="35" w16cid:durableId="2102406304">
-    <w:abstractNumId w:val="9"/>
-  </w:num>
-  <w:num w:numId="36" w16cid:durableId="1750688427">
-    <w:abstractNumId w:val="0"/>
-  </w:num>
-  <w:num w:numId="37" w16cid:durableId="1516457938">
-    <w:abstractNumId w:val="32"/>
-  </w:num>
-  <w:num w:numId="38" w16cid:durableId="913203381">
-    <w:abstractNumId w:val="14"/>
-  </w:num>
-  <w:num w:numId="39" w16cid:durableId="1231425337">
-    <w:abstractNumId w:val="10"/>
-  </w:num>
-  <w:num w:numId="40" w16cid:durableId="282809271">
-    <w:abstractNumId w:val="22"/>
-  </w:num>
-  <w:num w:numId="41" w16cid:durableId="880941884">
-    <w:abstractNumId w:val="14"/>
-  </w:num>
-  <w:num w:numId="42" w16cid:durableId="1114859515">
-    <w:abstractNumId w:val="14"/>
-  </w:num>
-  <w:num w:numId="43" w16cid:durableId="2105034759">
-    <w:abstractNumId w:val="1"/>
-  </w:num>
-  <w:num w:numId="44" w16cid:durableId="344282800">
-    <w:abstractNumId w:val="14"/>
-  </w:num>
-  <w:num w:numId="45" w16cid:durableId="2059042353">
-    <w:abstractNumId w:val="30"/>
-  </w:num>
-  <w:num w:numId="46" w16cid:durableId="895899973">
-    <w:abstractNumId w:val="14"/>
-  </w:num>
-  <w:num w:numId="47" w16cid:durableId="176165479">
-    <w:abstractNumId w:val="16"/>
-  </w:num>
-  <w:num w:numId="48" w16cid:durableId="367724424">
-    <w:abstractNumId w:val="14"/>
-  </w:num>
-  <w:num w:numId="49" w16cid:durableId="761725539">
-    <w:abstractNumId w:val="15"/>
-  </w:num>
-  <w:num w:numId="50" w16cid:durableId="1242711684">
-    <w:abstractNumId w:val="14"/>
-  </w:num>
-  <w:num w:numId="51" w16cid:durableId="1528832066">
-    <w:abstractNumId w:val="14"/>
-  </w:num>
-  <w:numIdMacAtCleanup w:val="29"/>
+  <w:numIdMacAtCleanup w:val="34"/>
 </w:numbering>
 </file>
 
@@ -14619,7 +13705,7 @@
     <w:rsid w:val="00786EEE"/>
     <w:pPr>
       <w:numPr>
-        <w:numId w:val="25"/>
+        <w:numId w:val="24"/>
       </w:numPr>
     </w:pPr>
   </w:style>
@@ -14634,7 +13720,7 @@
       <w:keepLines/>
       <w:numPr>
         <w:ilvl w:val="2"/>
-        <w:numId w:val="27"/>
+        <w:numId w:val="26"/>
       </w:numPr>
       <w:ind w:left="1135" w:hanging="284"/>
     </w:pPr>
@@ -14669,7 +13755,7 @@
       <w:keepLines/>
       <w:numPr>
         <w:ilvl w:val="5"/>
-        <w:numId w:val="27"/>
+        <w:numId w:val="26"/>
       </w:numPr>
       <w:spacing w:before="160" w:after="160"/>
       <w:contextualSpacing/>
@@ -14736,7 +13822,7 @@
     <w:rsid w:val="00786EEE"/>
     <w:pPr>
       <w:numPr>
-        <w:numId w:val="26"/>
+        <w:numId w:val="25"/>
       </w:numPr>
     </w:pPr>
   </w:style>
@@ -14747,7 +13833,7 @@
     <w:rsid w:val="0004099E"/>
     <w:pPr>
       <w:numPr>
-        <w:numId w:val="28"/>
+        <w:numId w:val="27"/>
       </w:numPr>
       <w:pBdr>
         <w:top w:val="single" w:sz="4" w:space="3" w:color="00CB5D" w:themeColor="accent5"/>
@@ -14778,7 +13864,7 @@
     <w:pPr>
       <w:numPr>
         <w:ilvl w:val="1"/>
-        <w:numId w:val="28"/>
+        <w:numId w:val="27"/>
       </w:numPr>
       <w:pBdr>
         <w:top w:val="single" w:sz="4" w:space="3" w:color="00CB5D" w:themeColor="accent5"/>
@@ -14806,7 +13892,7 @@
     <w:pPr>
       <w:numPr>
         <w:ilvl w:val="2"/>
-        <w:numId w:val="28"/>
+        <w:numId w:val="27"/>
       </w:numPr>
       <w:ind w:left="284" w:hanging="284"/>
       <w:contextualSpacing/>
@@ -14820,7 +13906,7 @@
     <w:pPr>
       <w:numPr>
         <w:ilvl w:val="3"/>
-        <w:numId w:val="28"/>
+        <w:numId w:val="27"/>
       </w:numPr>
       <w:tabs>
         <w:tab w:val="left" w:pos="1134"/>
@@ -14838,7 +13924,7 @@
     <w:pPr>
       <w:numPr>
         <w:ilvl w:val="6"/>
-        <w:numId w:val="28"/>
+        <w:numId w:val="27"/>
       </w:numPr>
       <w:ind w:left="284" w:hanging="284"/>
       <w:contextualSpacing/>
@@ -14853,7 +13939,7 @@
     <w:pPr>
       <w:numPr>
         <w:ilvl w:val="7"/>
-        <w:numId w:val="28"/>
+        <w:numId w:val="27"/>
       </w:numPr>
       <w:ind w:left="284" w:hanging="284"/>
       <w:contextualSpacing/>
@@ -15000,7 +14086,7 @@
       <w:keepNext/>
       <w:keepLines/>
       <w:numPr>
-        <w:numId w:val="29"/>
+        <w:numId w:val="28"/>
       </w:numPr>
       <w:contextualSpacing/>
     </w:pPr>
@@ -15447,7 +14533,7 @@
       <w:keepLines/>
       <w:numPr>
         <w:ilvl w:val="2"/>
-        <w:numId w:val="29"/>
+        <w:numId w:val="28"/>
       </w:numPr>
       <w:contextualSpacing/>
     </w:pPr>
@@ -15547,7 +14633,7 @@
       <w:keepLines/>
       <w:numPr>
         <w:ilvl w:val="3"/>
-        <w:numId w:val="29"/>
+        <w:numId w:val="28"/>
       </w:numPr>
     </w:pPr>
     <w:rPr>
@@ -18228,12 +17314,13 @@
 
 <file path=word/glossary/fontTable.xml><?xml version="1.0" encoding="utf-8"?>
 <w:fonts xmlns:mc="http://schemas.openxmlformats.org/markup-compatibility/2006" xmlns:r="http://schemas.openxmlformats.org/officeDocument/2006/relationships" xmlns:w="http://schemas.openxmlformats.org/wordprocessingml/2006/main" xmlns:w14="http://schemas.microsoft.com/office/word/2010/wordml" xmlns:w15="http://schemas.microsoft.com/office/word/2012/wordml" xmlns:w16cex="http://schemas.microsoft.com/office/word/2018/wordml/cex" xmlns:w16cid="http://schemas.microsoft.com/office/word/2016/wordml/cid" xmlns:w16="http://schemas.microsoft.com/office/word/2018/wordml" xmlns:w16du="http://schemas.microsoft.com/office/word/2023/wordml/word16du" xmlns:w16sdtdh="http://schemas.microsoft.com/office/word/2020/wordml/sdtdatahash" xmlns:w16sdtfl="http://schemas.microsoft.com/office/word/2024/wordml/sdtformatlock" xmlns:w16se="http://schemas.microsoft.com/office/word/2015/wordml/symex" mc:Ignorable="w14 w15 w16se w16cid w16 w16cex w16sdtdh w16sdtfl w16du">
-  <w:font w:name="Symbol">
-    <w:panose1 w:val="05050102010706020507"/>
-    <w:charset w:val="02"/>
+  <w:font w:name="Arial Bold">
+    <w:altName w:val="Arial"/>
+    <w:panose1 w:val="00000000000000000000"/>
+    <w:charset w:val="00"/>
     <w:family w:val="roman"/>
-    <w:pitch w:val="variable"/>
-    <w:sig w:usb0="00000000" w:usb1="10000000" w:usb2="00000000" w:usb3="00000000" w:csb0="80000000" w:csb1="00000000"/>
+    <w:notTrueType/>
+    <w:pitch w:val="default"/>
   </w:font>
   <w:font w:name="Times New Roman">
     <w:panose1 w:val="02020603050405020304"/>
@@ -18241,6 +17328,20 @@
     <w:family w:val="roman"/>
     <w:pitch w:val="variable"/>
     <w:sig w:usb0="E0002EFF" w:usb1="C000785B" w:usb2="00000009" w:usb3="00000000" w:csb0="000001FF" w:csb1="00000000"/>
+  </w:font>
+  <w:font w:name="Arial">
+    <w:panose1 w:val="020B0604020202020204"/>
+    <w:charset w:val="00"/>
+    <w:family w:val="swiss"/>
+    <w:pitch w:val="variable"/>
+    <w:sig w:usb0="E0002EFF" w:usb1="C000785B" w:usb2="00000009" w:usb3="00000000" w:csb0="000001FF" w:csb1="00000000"/>
+  </w:font>
+  <w:font w:name="Symbol">
+    <w:panose1 w:val="05050102010706020507"/>
+    <w:charset w:val="02"/>
+    <w:family w:val="roman"/>
+    <w:pitch w:val="variable"/>
+    <w:sig w:usb0="00000000" w:usb1="10000000" w:usb2="00000000" w:usb3="00000000" w:csb0="80000000" w:csb1="00000000"/>
   </w:font>
   <w:font w:name="Courier New">
     <w:panose1 w:val="02070309020205020404"/>
@@ -18255,21 +17356,6 @@
     <w:family w:val="auto"/>
     <w:pitch w:val="variable"/>
     <w:sig w:usb0="00000000" w:usb1="10000000" w:usb2="00000000" w:usb3="00000000" w:csb0="80000000" w:csb1="00000000"/>
-  </w:font>
-  <w:font w:name="Arial Bold">
-    <w:altName w:val="Arial"/>
-    <w:panose1 w:val="00000000000000000000"/>
-    <w:charset w:val="00"/>
-    <w:family w:val="roman"/>
-    <w:notTrueType/>
-    <w:pitch w:val="default"/>
-  </w:font>
-  <w:font w:name="Arial">
-    <w:panose1 w:val="020B0604020202020204"/>
-    <w:charset w:val="00"/>
-    <w:family w:val="swiss"/>
-    <w:pitch w:val="variable"/>
-    <w:sig w:usb0="E0002EFF" w:usb1="C000785B" w:usb2="00000009" w:usb3="00000000" w:csb0="000001FF" w:csb1="00000000"/>
   </w:font>
   <w:font w:name="Georgia">
     <w:panose1 w:val="02040502050405020303"/>
@@ -18336,6 +17422,7 @@
     <w:rsid w:val="0012429A"/>
     <w:rsid w:val="00155B5A"/>
     <w:rsid w:val="001635D1"/>
+    <w:rsid w:val="001B742B"/>
     <w:rsid w:val="00266407"/>
     <w:rsid w:val="004125B6"/>
     <w:rsid w:val="00471DE8"/>
@@ -18350,6 +17437,7 @@
     <w:rsid w:val="008809DA"/>
     <w:rsid w:val="008A30B5"/>
     <w:rsid w:val="008D1BCF"/>
+    <w:rsid w:val="00953007"/>
     <w:rsid w:val="009F2F15"/>
     <w:rsid w:val="00A410C9"/>
     <w:rsid w:val="00A4777A"/>
@@ -18362,6 +17450,7 @@
     <w:rsid w:val="00E563C7"/>
     <w:rsid w:val="00E861EE"/>
     <w:rsid w:val="00E96A49"/>
+    <w:rsid w:val="00EA1D8A"/>
     <w:rsid w:val="00EA681D"/>
     <w:rsid w:val="00F00A61"/>
   </w:rsids>
@@ -18819,7 +17908,7 @@
     <w:basedOn w:val="Fuentedeprrafopredeter"/>
     <w:uiPriority w:val="99"/>
     <w:semiHidden/>
-    <w:rsid w:val="0012429A"/>
+    <w:rsid w:val="00953007"/>
     <w:rPr>
       <w:color w:val="808080"/>
     </w:rPr>
@@ -18863,30 +17952,6 @@
   <w:style w:type="paragraph" w:customStyle="1" w:styleId="3C2D8E3AC4AA492FA50EEDAB34C6C072">
     <w:name w:val="3C2D8E3AC4AA492FA50EEDAB34C6C072"/>
     <w:rsid w:val="007677C8"/>
-    <w:pPr>
-      <w:spacing w:line="278" w:lineRule="auto"/>
-    </w:pPr>
-    <w:rPr>
-      <w:sz w:val="24"/>
-      <w:szCs w:val="24"/>
-      <w:lang w:val="es-MX" w:eastAsia="es-MX"/>
-    </w:rPr>
-  </w:style>
-  <w:style w:type="paragraph" w:customStyle="1" w:styleId="30AB1338CF2F4B00BACD76A686970EF8">
-    <w:name w:val="30AB1338CF2F4B00BACD76A686970EF8"/>
-    <w:rsid w:val="0012429A"/>
-    <w:pPr>
-      <w:spacing w:line="278" w:lineRule="auto"/>
-    </w:pPr>
-    <w:rPr>
-      <w:sz w:val="24"/>
-      <w:szCs w:val="24"/>
-      <w:lang w:val="es-MX" w:eastAsia="es-MX"/>
-    </w:rPr>
-  </w:style>
-  <w:style w:type="paragraph" w:customStyle="1" w:styleId="2EFB83BBDE7C4BBFA9085005CE96DA47">
-    <w:name w:val="2EFB83BBDE7C4BBFA9085005CE96DA47"/>
-    <w:rsid w:val="009F2F15"/>
     <w:pPr>
       <w:spacing w:line="278" w:lineRule="auto"/>
     </w:pPr>
@@ -19168,10 +18233,6 @@
 </file>
 
 <file path=customXml/item1.xml><?xml version="1.0" encoding="utf-8"?>
-<b:Sources xmlns:b="http://schemas.openxmlformats.org/officeDocument/2006/bibliography" xmlns="http://schemas.openxmlformats.org/officeDocument/2006/bibliography" SelectedStyle="\APASixthEditionOfficeOnline.xsl" StyleName="APA" Version="6"/>
-</file>
-
-<file path=customXml/item2.xml><?xml version="1.0" encoding="utf-8"?>
 <p:properties xmlns:p="http://schemas.microsoft.com/office/2006/metadata/properties" xmlns:xsi="http://www.w3.org/2001/XMLSchema-instance" xmlns:pc="http://schemas.microsoft.com/office/infopath/2007/PartnerControls">
   <documentManagement>
     <TaxCatchAll xmlns="e8cafdd4-4528-4476-ab16-00a5750ab81c">
@@ -19210,16 +18271,11 @@
 </p:properties>
 </file>
 
-<file path=customXml/item3.xml><?xml version="1.0" encoding="utf-8"?>
-<?mso-contentType ?>
-<FormTemplates xmlns="http://schemas.microsoft.com/sharepoint/v3/contenttype/forms">
-  <Display>DocumentLibraryForm</Display>
-  <Edit>DocumentLibraryForm</Edit>
-  <New>DocumentLibraryForm</New>
-</FormTemplates>
+<file path=customXml/item2.xml><?xml version="1.0" encoding="utf-8"?>
+<b:Sources xmlns:b="http://schemas.openxmlformats.org/officeDocument/2006/bibliography" xmlns="http://schemas.openxmlformats.org/officeDocument/2006/bibliography" SelectedStyle="\APASixthEditionOfficeOnline.xsl" StyleName="APA" Version="6"/>
 </file>
 
-<file path=customXml/item4.xml><?xml version="1.0" encoding="utf-8"?>
+<file path=customXml/item3.xml><?xml version="1.0" encoding="utf-8"?>
 <ct:contentTypeSchema xmlns:ct="http://schemas.microsoft.com/office/2006/metadata/contentType" xmlns:ma="http://schemas.microsoft.com/office/2006/metadata/properties/metaAttributes" ct:_="" ma:_="" ma:contentTypeName="DocumentT2K" ma:contentTypeID="0x01010040A11AC9A095403B86EC8B98C09708A300B18DC44D3AD07641A07CA18912D9B9CC" ma:contentTypeVersion="11" ma:contentTypeDescription="Create a new document." ma:contentTypeScope="" ma:versionID="701d11ae743ac7596960786f37d221fe">
   <xsd:schema xmlns:xsd="http://www.w3.org/2001/XMLSchema" xmlns:xs="http://www.w3.org/2001/XMLSchema" xmlns:p="http://schemas.microsoft.com/office/2006/metadata/properties" xmlns:ns2="e8cafdd4-4528-4476-ab16-00a5750ab81c" xmlns:ns3="f9e5c6ed-a414-487d-8643-813a0aafc40d" targetNamespace="http://schemas.microsoft.com/office/2006/metadata/properties" ma:root="true" ma:fieldsID="cffc13d3396995e8abe70a7def73cd96" ns2:_="" ns3:_="">
     <xsd:import namespace="e8cafdd4-4528-4476-ab16-00a5750ab81c"/>
@@ -19450,15 +18506,16 @@
 </ct:contentTypeSchema>
 </file>
 
-<file path=customXml/itemProps1.xml><?xml version="1.0" encoding="utf-8"?>
-<ds:datastoreItem xmlns:ds="http://schemas.openxmlformats.org/officeDocument/2006/customXml" ds:itemID="{98BD03B9-BFAB-42BE-8091-69031DD3A8CE}">
-  <ds:schemaRefs>
-    <ds:schemaRef ds:uri="http://schemas.openxmlformats.org/officeDocument/2006/bibliography"/>
-  </ds:schemaRefs>
-</ds:datastoreItem>
+<file path=customXml/item4.xml><?xml version="1.0" encoding="utf-8"?>
+<?mso-contentType ?>
+<FormTemplates xmlns="http://schemas.microsoft.com/sharepoint/v3/contenttype/forms">
+  <Display>DocumentLibraryForm</Display>
+  <Edit>DocumentLibraryForm</Edit>
+  <New>DocumentLibraryForm</New>
+</FormTemplates>
 </file>
 
-<file path=customXml/itemProps2.xml><?xml version="1.0" encoding="utf-8"?>
+<file path=customXml/itemProps1.xml><?xml version="1.0" encoding="utf-8"?>
 <ds:datastoreItem xmlns:ds="http://schemas.openxmlformats.org/officeDocument/2006/customXml" ds:itemID="{B6ADF4F3-5389-4261-BA50-D9C1C4EE966F}">
   <ds:schemaRefs>
     <ds:schemaRef ds:uri="http://schemas.microsoft.com/office/2006/metadata/properties"/>
@@ -19469,15 +18526,15 @@
 </ds:datastoreItem>
 </file>
 
-<file path=customXml/itemProps3.xml><?xml version="1.0" encoding="utf-8"?>
-<ds:datastoreItem xmlns:ds="http://schemas.openxmlformats.org/officeDocument/2006/customXml" ds:itemID="{F4033E51-A133-484E-A999-B47BB42AC722}">
+<file path=customXml/itemProps2.xml><?xml version="1.0" encoding="utf-8"?>
+<ds:datastoreItem xmlns:ds="http://schemas.openxmlformats.org/officeDocument/2006/customXml" ds:itemID="{98BD03B9-BFAB-42BE-8091-69031DD3A8CE}">
   <ds:schemaRefs>
-    <ds:schemaRef ds:uri="http://schemas.microsoft.com/sharepoint/v3/contenttype/forms"/>
+    <ds:schemaRef ds:uri="http://schemas.openxmlformats.org/officeDocument/2006/bibliography"/>
   </ds:schemaRefs>
 </ds:datastoreItem>
 </file>
 
-<file path=customXml/itemProps4.xml><?xml version="1.0" encoding="utf-8"?>
+<file path=customXml/itemProps3.xml><?xml version="1.0" encoding="utf-8"?>
 <ds:datastoreItem xmlns:ds="http://schemas.openxmlformats.org/officeDocument/2006/customXml" ds:itemID="{C07A11A4-2E83-48A0-BC8D-4B63EACBB808}">
   <ds:schemaRefs>
     <ds:schemaRef ds:uri="http://schemas.microsoft.com/office/2006/metadata/contentType"/>
@@ -19496,6 +18553,14 @@
 </ds:datastoreItem>
 </file>
 
+<file path=customXml/itemProps4.xml><?xml version="1.0" encoding="utf-8"?>
+<ds:datastoreItem xmlns:ds="http://schemas.openxmlformats.org/officeDocument/2006/customXml" ds:itemID="{F4033E51-A133-484E-A999-B47BB42AC722}">
+  <ds:schemaRefs>
+    <ds:schemaRef ds:uri="http://schemas.microsoft.com/sharepoint/v3/contenttype/forms"/>
+  </ds:schemaRefs>
+</ds:datastoreItem>
+</file>
+
 <file path=docMetadata/LabelInfo.xml><?xml version="1.0" encoding="utf-8"?>
 <clbl:labelList xmlns:clbl="http://schemas.microsoft.com/office/2020/mipLabelMetadata">
   <clbl:label id="{3048dc87-43f0-4100-9acb-ae1971c79395}" enabled="0" method="" siteId="{3048dc87-43f0-4100-9acb-ae1971c79395}" removed="1"/>

</xml_diff>